<commit_message>
change template to margin and header
</commit_message>
<xml_diff>
--- a/estimate_template.docx
+++ b/estimate_template.docx
@@ -183,746 +183,633 @@
         <w:br/>
       </w:r>
     </w:p>
-    <w:tbl>
-      <w:tblPr>
-        <w:tblW w:w="8890" w:type="dxa"/>
-        <w:tblLayout w:type="fixed"/>
-        <w:tblLook w:val="04A0" w:firstRow="1" w:lastRow="0" w:firstColumn="1" w:lastColumn="0" w:noHBand="0" w:noVBand="1"/>
-      </w:tblPr>
-      <w:tblGrid>
-        <w:gridCol w:w="3330"/>
-        <w:gridCol w:w="5560"/>
-      </w:tblGrid>
-      <w:tr>
-        <w:trPr>
-          <w:trHeight w:val="12863"/>
-        </w:trPr>
-        <w:tc>
-          <w:tcPr>
-            <w:tcW w:w="3330" w:type="dxa"/>
-          </w:tcPr>
-          <w:p>
-            <w:pPr>
-              <w:spacing w:after="40"/>
-            </w:pPr>
-          </w:p>
-        </w:tc>
-        <w:tc>
-          <w:tcPr>
-            <w:tcW w:w="5560" w:type="dxa"/>
-          </w:tcPr>
-          <w:p/>
-          <w:p>
-            <w:pPr>
-              <w:rPr>
-                <w:sz w:val="24"/>
-              </w:rPr>
-            </w:pPr>
-          </w:p>
-          <w:p>
-            <w:pPr>
-              <w:rPr>
-                <w:sz w:val="24"/>
-              </w:rPr>
-            </w:pPr>
-          </w:p>
-          <w:p>
-            <w:pPr>
-              <w:rPr>
-                <w:sz w:val="24"/>
-              </w:rPr>
-            </w:pPr>
-          </w:p>
-          <w:p>
-            <w:pPr>
-              <w:rPr>
-                <w:sz w:val="24"/>
-              </w:rPr>
-            </w:pPr>
-          </w:p>
-          <w:p>
-            <w:r>
-              <w:rPr>
-                <w:color w:val="323232"/>
-                <w:sz w:val="24"/>
-                <w:szCs w:val="24"/>
-              </w:rPr>
-              <w:t>Dear {{CLIENT_NAME}},</w:t>
-            </w:r>
-            <w:r>
-              <w:rPr>
-                <w:sz w:val="24"/>
-              </w:rPr>
-              <w:br/>
-            </w:r>
-            <w:r>
-              <w:rPr>
-                <w:b/>
-                <w:color w:val="612D4B"/>
-                <w:sz w:val="28"/>
-              </w:rPr>
-              <w:br/>
-            </w:r>
-            <w:r>
-              <w:rPr>
-                <w:color w:val="323232"/>
-                <w:sz w:val="24"/>
-                <w:szCs w:val="24"/>
-              </w:rPr>
-              <w:t>Thank you for the opportunity, to provide our services for your events. We look forward to sharing our services with you and your guests. Booking staff, planning and directing an event can be stressful. Therefore, we promise to do</w:t>
-            </w:r>
-            <w:r>
-              <w:rPr>
-                <w:color w:val="323232"/>
-                <w:sz w:val="24"/>
-                <w:szCs w:val="24"/>
-              </w:rPr>
-              <w:t xml:space="preserve"> </w:t>
-            </w:r>
-            <w:r>
-              <w:rPr>
-                <w:color w:val="323232"/>
-                <w:sz w:val="24"/>
-                <w:szCs w:val="24"/>
-              </w:rPr>
-              <w:t>everything we can to ease the burden on you.</w:t>
-            </w:r>
-          </w:p>
-          <w:p>
-            <w:pPr>
-              <w:pStyle w:val="Default"/>
-              <w:rPr>
-                <w:rFonts w:asciiTheme="minorHAnsi" w:eastAsiaTheme="minorEastAsia" w:hAnsiTheme="minorHAnsi"/>
-                <w:color w:val="323232"/>
-                <w:szCs w:val="24"/>
-              </w:rPr>
-            </w:pPr>
-            <w:r>
-              <w:rPr>
-                <w:rFonts w:asciiTheme="minorHAnsi" w:eastAsiaTheme="minorEastAsia" w:hAnsiTheme="minorHAnsi"/>
-                <w:color w:val="323232"/>
-                <w:szCs w:val="24"/>
-              </w:rPr>
-              <w:t xml:space="preserve">We have taken all of your concerns and requests into consideration as we developed this proposal and quote. We would like to assure you that our wait </w:t>
-            </w:r>
-            <w:proofErr w:type="spellStart"/>
-            <w:proofErr w:type="gramStart"/>
-            <w:r>
-              <w:rPr>
-                <w:rFonts w:asciiTheme="minorHAnsi" w:eastAsiaTheme="minorEastAsia" w:hAnsiTheme="minorHAnsi"/>
-                <w:color w:val="323232"/>
-                <w:szCs w:val="24"/>
-              </w:rPr>
-              <w:t>staff,catering</w:t>
-            </w:r>
-            <w:proofErr w:type="spellEnd"/>
-            <w:proofErr w:type="gramEnd"/>
-            <w:r>
-              <w:rPr>
-                <w:rFonts w:asciiTheme="minorHAnsi" w:eastAsiaTheme="minorEastAsia" w:hAnsiTheme="minorHAnsi"/>
-                <w:color w:val="323232"/>
-                <w:szCs w:val="24"/>
-              </w:rPr>
-              <w:t xml:space="preserve"> and event services will meet your high food standards and suit your personal tastes.</w:t>
-            </w:r>
-          </w:p>
-          <w:p>
-            <w:pPr>
-              <w:pStyle w:val="Default"/>
-              <w:rPr>
-                <w:rFonts w:asciiTheme="minorHAnsi" w:eastAsiaTheme="minorEastAsia" w:hAnsiTheme="minorHAnsi"/>
-                <w:color w:val="323232"/>
-                <w:szCs w:val="24"/>
-              </w:rPr>
-            </w:pPr>
-            <w:r>
-              <w:rPr>
-                <w:rFonts w:asciiTheme="minorHAnsi" w:eastAsiaTheme="minorEastAsia" w:hAnsiTheme="minorHAnsi"/>
-                <w:color w:val="323232"/>
-                <w:szCs w:val="24"/>
-              </w:rPr>
-              <w:t xml:space="preserve">In this proposal, we have only included the services that you have </w:t>
-            </w:r>
-            <w:proofErr w:type="spellStart"/>
-            <w:proofErr w:type="gramStart"/>
-            <w:r>
-              <w:rPr>
-                <w:rFonts w:asciiTheme="minorHAnsi" w:eastAsiaTheme="minorEastAsia" w:hAnsiTheme="minorHAnsi"/>
-                <w:color w:val="323232"/>
-                <w:szCs w:val="24"/>
-              </w:rPr>
-              <w:t>selected.Please</w:t>
-            </w:r>
-            <w:proofErr w:type="spellEnd"/>
-            <w:proofErr w:type="gramEnd"/>
-            <w:r>
-              <w:rPr>
-                <w:rFonts w:asciiTheme="minorHAnsi" w:eastAsiaTheme="minorEastAsia" w:hAnsiTheme="minorHAnsi"/>
-                <w:color w:val="323232"/>
-                <w:szCs w:val="24"/>
-              </w:rPr>
-              <w:t xml:space="preserve"> feel free to notify us if you have any concerns or additional services </w:t>
-            </w:r>
-            <w:proofErr w:type="spellStart"/>
-            <w:r>
-              <w:rPr>
-                <w:rFonts w:asciiTheme="minorHAnsi" w:eastAsiaTheme="minorEastAsia" w:hAnsiTheme="minorHAnsi"/>
-                <w:color w:val="323232"/>
-                <w:szCs w:val="24"/>
-              </w:rPr>
-              <w:t>thatyou</w:t>
-            </w:r>
-            <w:proofErr w:type="spellEnd"/>
-            <w:r>
-              <w:rPr>
-                <w:rFonts w:asciiTheme="minorHAnsi" w:eastAsiaTheme="minorEastAsia" w:hAnsiTheme="minorHAnsi"/>
-                <w:color w:val="323232"/>
-                <w:szCs w:val="24"/>
-              </w:rPr>
-              <w:t xml:space="preserve"> would like to request. We hope that you will find this proposal to your </w:t>
-            </w:r>
-            <w:proofErr w:type="spellStart"/>
-            <w:proofErr w:type="gramStart"/>
-            <w:r>
-              <w:rPr>
-                <w:rFonts w:asciiTheme="minorHAnsi" w:eastAsiaTheme="minorEastAsia" w:hAnsiTheme="minorHAnsi"/>
-                <w:color w:val="323232"/>
-                <w:szCs w:val="24"/>
-              </w:rPr>
-              <w:t>liking.We</w:t>
-            </w:r>
-            <w:proofErr w:type="spellEnd"/>
-            <w:proofErr w:type="gramEnd"/>
-            <w:r>
-              <w:rPr>
-                <w:rFonts w:asciiTheme="minorHAnsi" w:eastAsiaTheme="minorEastAsia" w:hAnsiTheme="minorHAnsi"/>
-                <w:color w:val="323232"/>
-                <w:szCs w:val="24"/>
-              </w:rPr>
-              <w:t xml:space="preserve"> are looking forward to helping provide all your guests with an enjoyable and unforgettable experience.</w:t>
-            </w:r>
-          </w:p>
-          <w:p>
-            <w:pPr>
-              <w:pStyle w:val="Default"/>
-              <w:rPr>
-                <w:rFonts w:asciiTheme="minorHAnsi" w:eastAsiaTheme="minorEastAsia" w:hAnsiTheme="minorHAnsi"/>
-                <w:color w:val="323232"/>
-                <w:szCs w:val="24"/>
-              </w:rPr>
-            </w:pPr>
-            <w:r>
-              <w:rPr>
-                <w:rFonts w:asciiTheme="minorHAnsi" w:eastAsiaTheme="minorEastAsia" w:hAnsiTheme="minorHAnsi"/>
-                <w:color w:val="323232"/>
-                <w:szCs w:val="24"/>
-              </w:rPr>
-              <w:t>Sincerely</w:t>
-            </w:r>
-            <w:r>
-              <w:rPr>
-                <w:rFonts w:asciiTheme="minorHAnsi" w:eastAsiaTheme="minorEastAsia" w:hAnsiTheme="minorHAnsi"/>
-                <w:color w:val="323232"/>
-                <w:szCs w:val="24"/>
-              </w:rPr>
-              <w:t>.</w:t>
-            </w:r>
-          </w:p>
-          <w:p>
-            <w:pPr>
-              <w:pStyle w:val="Default"/>
-              <w:rPr>
-                <w:rFonts w:asciiTheme="minorHAnsi" w:eastAsiaTheme="minorEastAsia" w:hAnsiTheme="minorHAnsi"/>
-                <w:color w:val="323232"/>
-                <w:szCs w:val="24"/>
-              </w:rPr>
-            </w:pPr>
-            <w:r>
-              <w:rPr>
-                <w:rFonts w:asciiTheme="minorHAnsi" w:eastAsiaTheme="minorEastAsia" w:hAnsiTheme="minorHAnsi"/>
-                <w:color w:val="323232"/>
-                <w:szCs w:val="24"/>
-              </w:rPr>
-              <w:t>_______________________</w:t>
-            </w:r>
-            <w:r>
-              <w:rPr>
-                <w:rFonts w:asciiTheme="minorHAnsi" w:eastAsiaTheme="minorEastAsia" w:hAnsiTheme="minorHAnsi"/>
-                <w:color w:val="323232"/>
-                <w:szCs w:val="24"/>
-              </w:rPr>
-              <w:t>_____________</w:t>
-            </w:r>
-          </w:p>
-          <w:p>
-            <w:pPr>
-              <w:pStyle w:val="Default"/>
-              <w:rPr>
-                <w:rFonts w:asciiTheme="minorHAnsi" w:eastAsiaTheme="minorEastAsia" w:hAnsiTheme="minorHAnsi"/>
-                <w:color w:val="323232"/>
-                <w:szCs w:val="24"/>
-              </w:rPr>
-            </w:pPr>
-            <w:r>
-              <w:rPr>
-                <w:rFonts w:asciiTheme="minorHAnsi" w:eastAsiaTheme="minorEastAsia" w:hAnsiTheme="minorHAnsi"/>
-                <w:color w:val="323232"/>
-                <w:szCs w:val="24"/>
-              </w:rPr>
-              <w:t>{{REPRESENTATIVE_NAME}}</w:t>
-            </w:r>
-          </w:p>
-          <w:p/>
-        </w:tc>
-      </w:tr>
-    </w:tbl>
+    <w:p>
+      <w:pPr>
+        <w:rPr>
+          <w:color w:val="323232"/>
+          <w:sz w:val="24"/>
+          <w:szCs w:val="24"/>
+        </w:rPr>
+        <w:sectPr>
+          <w:headerReference w:type="default" r:id="rId9"/>
+          <w:pgSz w:w="12240" w:h="15840"/>
+          <w:pgMar w:top="1440" w:right="1800" w:bottom="1440" w:left="1800" w:header="0" w:footer="0" w:gutter="0"/>
+          <w:cols w:space="720"/>
+          <w:formProt w:val="0"/>
+          <w:titlePg/>
+          <w:docGrid w:linePitch="360" w:charSpace="4096"/>
+        </w:sectPr>
+      </w:pPr>
+    </w:p>
     <w:p>
       <w:r>
+        <w:rPr>
+          <w:color w:val="323232"/>
+          <w:sz w:val="24"/>
+          <w:szCs w:val="24"/>
+        </w:rPr>
         <w:lastRenderedPageBreak/>
+        <w:t>Dear {{CLIENT_NAME}},</w:t>
+      </w:r>
+      <w:r>
+        <w:rPr>
+          <w:sz w:val="24"/>
+        </w:rPr>
+        <w:br/>
+      </w:r>
+      <w:r>
+        <w:rPr>
+          <w:b/>
+          <w:color w:val="612D4B"/>
+          <w:sz w:val="28"/>
+        </w:rPr>
+        <w:br/>
+      </w:r>
+      <w:r>
+        <w:rPr>
+          <w:color w:val="323232"/>
+          <w:sz w:val="24"/>
+          <w:szCs w:val="24"/>
+        </w:rPr>
+        <w:t>Thank you for the opportunity, to provide our services for your events. We look forward to sharing our services with you and your guests. Booking staff, planning and directing an event can be stressful. Therefore, we promise to do everything we can to ease the burden on you.</w:t>
+      </w:r>
+    </w:p>
+    <w:p>
+      <w:pPr>
+        <w:pStyle w:val="Default"/>
+        <w:rPr>
+          <w:rFonts w:asciiTheme="minorHAnsi" w:eastAsiaTheme="minorEastAsia" w:hAnsiTheme="minorHAnsi"/>
+          <w:color w:val="323232"/>
+          <w:szCs w:val="24"/>
+        </w:rPr>
+      </w:pPr>
+      <w:r>
+        <w:rPr>
+          <w:rFonts w:asciiTheme="minorHAnsi" w:eastAsiaTheme="minorEastAsia" w:hAnsiTheme="minorHAnsi"/>
+          <w:color w:val="323232"/>
+          <w:szCs w:val="24"/>
+        </w:rPr>
+        <w:t xml:space="preserve">We have taken all of your concerns and requests into consideration as we developed this proposal and quote. We would like to assure you that our wait </w:t>
+      </w:r>
+      <w:proofErr w:type="spellStart"/>
+      <w:r>
+        <w:rPr>
+          <w:rFonts w:asciiTheme="minorHAnsi" w:eastAsiaTheme="minorEastAsia" w:hAnsiTheme="minorHAnsi"/>
+          <w:color w:val="323232"/>
+          <w:szCs w:val="24"/>
+        </w:rPr>
+        <w:t>staff,catering</w:t>
+      </w:r>
+      <w:proofErr w:type="spellEnd"/>
+      <w:r>
+        <w:rPr>
+          <w:rFonts w:asciiTheme="minorHAnsi" w:eastAsiaTheme="minorEastAsia" w:hAnsiTheme="minorHAnsi"/>
+          <w:color w:val="323232"/>
+          <w:szCs w:val="24"/>
+        </w:rPr>
+        <w:t xml:space="preserve"> and event services will meet your high food standards and suit your personal tastes.</w:t>
+      </w:r>
+    </w:p>
+    <w:p>
+      <w:pPr>
+        <w:pStyle w:val="Default"/>
+        <w:rPr>
+          <w:rFonts w:asciiTheme="minorHAnsi" w:eastAsiaTheme="minorEastAsia" w:hAnsiTheme="minorHAnsi"/>
+          <w:color w:val="323232"/>
+          <w:szCs w:val="24"/>
+        </w:rPr>
+      </w:pPr>
+      <w:r>
+        <w:rPr>
+          <w:rFonts w:asciiTheme="minorHAnsi" w:eastAsiaTheme="minorEastAsia" w:hAnsiTheme="minorHAnsi"/>
+          <w:color w:val="323232"/>
+          <w:szCs w:val="24"/>
+        </w:rPr>
+        <w:t xml:space="preserve">In this proposal, we have only included the services that you have </w:t>
+      </w:r>
+      <w:proofErr w:type="spellStart"/>
+      <w:r>
+        <w:rPr>
+          <w:rFonts w:asciiTheme="minorHAnsi" w:eastAsiaTheme="minorEastAsia" w:hAnsiTheme="minorHAnsi"/>
+          <w:color w:val="323232"/>
+          <w:szCs w:val="24"/>
+        </w:rPr>
+        <w:t>selected.Please</w:t>
+      </w:r>
+      <w:proofErr w:type="spellEnd"/>
+      <w:r>
+        <w:rPr>
+          <w:rFonts w:asciiTheme="minorHAnsi" w:eastAsiaTheme="minorEastAsia" w:hAnsiTheme="minorHAnsi"/>
+          <w:color w:val="323232"/>
+          <w:szCs w:val="24"/>
+        </w:rPr>
+        <w:t xml:space="preserve"> feel free to notify us if you have any concerns or additional services </w:t>
+      </w:r>
+      <w:proofErr w:type="spellStart"/>
+      <w:r>
+        <w:rPr>
+          <w:rFonts w:asciiTheme="minorHAnsi" w:eastAsiaTheme="minorEastAsia" w:hAnsiTheme="minorHAnsi"/>
+          <w:color w:val="323232"/>
+          <w:szCs w:val="24"/>
+        </w:rPr>
+        <w:t>thatyou</w:t>
+      </w:r>
+      <w:proofErr w:type="spellEnd"/>
+      <w:r>
+        <w:rPr>
+          <w:rFonts w:asciiTheme="minorHAnsi" w:eastAsiaTheme="minorEastAsia" w:hAnsiTheme="minorHAnsi"/>
+          <w:color w:val="323232"/>
+          <w:szCs w:val="24"/>
+        </w:rPr>
+        <w:t xml:space="preserve"> would like to request. We hope that you will find this proposal to your </w:t>
+      </w:r>
+      <w:proofErr w:type="spellStart"/>
+      <w:r>
+        <w:rPr>
+          <w:rFonts w:asciiTheme="minorHAnsi" w:eastAsiaTheme="minorEastAsia" w:hAnsiTheme="minorHAnsi"/>
+          <w:color w:val="323232"/>
+          <w:szCs w:val="24"/>
+        </w:rPr>
+        <w:t>liking.We</w:t>
+      </w:r>
+      <w:proofErr w:type="spellEnd"/>
+      <w:r>
+        <w:rPr>
+          <w:rFonts w:asciiTheme="minorHAnsi" w:eastAsiaTheme="minorEastAsia" w:hAnsiTheme="minorHAnsi"/>
+          <w:color w:val="323232"/>
+          <w:szCs w:val="24"/>
+        </w:rPr>
+        <w:t xml:space="preserve"> are looking forward to helping provide all your guests with an enjoyable and unforgettable experience.</w:t>
+      </w:r>
+    </w:p>
+    <w:p>
+      <w:pPr>
+        <w:pStyle w:val="Default"/>
+        <w:rPr>
+          <w:rFonts w:asciiTheme="minorHAnsi" w:eastAsiaTheme="minorEastAsia" w:hAnsiTheme="minorHAnsi"/>
+          <w:color w:val="323232"/>
+          <w:szCs w:val="24"/>
+        </w:rPr>
+      </w:pPr>
+      <w:r>
+        <w:rPr>
+          <w:rFonts w:asciiTheme="minorHAnsi" w:eastAsiaTheme="minorEastAsia" w:hAnsiTheme="minorHAnsi"/>
+          <w:color w:val="323232"/>
+          <w:szCs w:val="24"/>
+        </w:rPr>
+        <w:t>Sincerely</w:t>
+      </w:r>
+      <w:r>
+        <w:rPr>
+          <w:rFonts w:asciiTheme="minorHAnsi" w:eastAsiaTheme="minorEastAsia" w:hAnsiTheme="minorHAnsi"/>
+          <w:color w:val="323232"/>
+          <w:szCs w:val="24"/>
+        </w:rPr>
+        <w:t>.</w:t>
+      </w:r>
+    </w:p>
+    <w:p>
+      <w:pPr>
+        <w:pStyle w:val="Default"/>
+        <w:rPr>
+          <w:rFonts w:asciiTheme="minorHAnsi" w:eastAsiaTheme="minorEastAsia" w:hAnsiTheme="minorHAnsi"/>
+          <w:color w:val="323232"/>
+          <w:szCs w:val="24"/>
+        </w:rPr>
+      </w:pPr>
+      <w:r>
+        <w:rPr>
+          <w:rFonts w:asciiTheme="minorHAnsi" w:eastAsiaTheme="minorEastAsia" w:hAnsiTheme="minorHAnsi"/>
+          <w:color w:val="323232"/>
+          <w:szCs w:val="24"/>
+        </w:rPr>
+        <w:t>_______________________</w:t>
+      </w:r>
+      <w:r>
+        <w:rPr>
+          <w:rFonts w:asciiTheme="minorHAnsi" w:eastAsiaTheme="minorEastAsia" w:hAnsiTheme="minorHAnsi"/>
+          <w:color w:val="323232"/>
+          <w:szCs w:val="24"/>
+        </w:rPr>
+        <w:t>_____________</w:t>
+      </w:r>
+    </w:p>
+    <w:p>
+      <w:pPr>
+        <w:pStyle w:val="Default"/>
+        <w:rPr>
+          <w:rFonts w:asciiTheme="minorHAnsi" w:eastAsiaTheme="minorEastAsia" w:hAnsiTheme="minorHAnsi"/>
+          <w:color w:val="323232"/>
+          <w:szCs w:val="24"/>
+        </w:rPr>
+      </w:pPr>
+      <w:r>
+        <w:rPr>
+          <w:rFonts w:asciiTheme="minorHAnsi" w:eastAsiaTheme="minorEastAsia" w:hAnsiTheme="minorHAnsi"/>
+          <w:color w:val="323232"/>
+          <w:szCs w:val="24"/>
+        </w:rPr>
+        <w:t>{{REPRESENTATIVE_NAME}}</w:t>
+      </w:r>
+    </w:p>
+    <w:p/>
+    <w:p/>
+    <w:p/>
+    <w:p/>
+    <w:p/>
+    <w:p/>
+    <w:p/>
+    <w:p/>
+    <w:p/>
+    <w:p/>
+    <w:p/>
+    <w:p/>
+    <w:p/>
+    <w:p/>
+    <w:p>
+      <w:r>
         <w:t>[DYNAMIC_CONTENT_START]</w:t>
       </w:r>
     </w:p>
-    <w:tbl>
-      <w:tblPr>
-        <w:tblW w:w="9803" w:type="dxa"/>
-        <w:tblInd w:w="-578" w:type="dxa"/>
-        <w:tblLayout w:type="fixed"/>
-        <w:tblLook w:val="04A0" w:firstRow="1" w:lastRow="0" w:firstColumn="1" w:lastColumn="0" w:noHBand="0" w:noVBand="1"/>
-      </w:tblPr>
-      <w:tblGrid>
-        <w:gridCol w:w="3672"/>
-        <w:gridCol w:w="6131"/>
-      </w:tblGrid>
-      <w:tr>
-        <w:trPr>
-          <w:trHeight w:val="14061"/>
-        </w:trPr>
-        <w:tc>
-          <w:tcPr>
-            <w:tcW w:w="3672" w:type="dxa"/>
-          </w:tcPr>
-          <w:p>
-            <w:pPr>
-              <w:spacing w:after="40"/>
-            </w:pPr>
-          </w:p>
-        </w:tc>
-        <w:tc>
-          <w:tcPr>
-            <w:tcW w:w="6131" w:type="dxa"/>
-          </w:tcPr>
-          <w:p>
-            <w:pPr>
-              <w:rPr>
-                <w:b/>
-                <w:color w:val="612D4B"/>
-                <w:sz w:val="24"/>
-              </w:rPr>
-            </w:pPr>
-            <w:r>
-              <w:rPr>
-                <w:b/>
-                <w:color w:val="612D4B"/>
-                <w:sz w:val="24"/>
-              </w:rPr>
-              <w:t>Explanation of Fees</w:t>
-            </w:r>
-          </w:p>
-          <w:p>
-            <w:pPr>
-              <w:rPr>
-                <w:b/>
-                <w:bCs/>
-                <w:sz w:val="20"/>
-                <w:szCs w:val="20"/>
-              </w:rPr>
-            </w:pPr>
-            <w:r>
-              <w:rPr>
-                <w:b/>
-                <w:bCs/>
-                <w:sz w:val="20"/>
-                <w:szCs w:val="20"/>
-              </w:rPr>
-              <w:t>Event Planning Service</w:t>
-            </w:r>
-          </w:p>
-          <w:p>
-            <w:pPr>
-              <w:jc w:val="both"/>
-              <w:rPr>
-                <w:sz w:val="20"/>
-                <w:szCs w:val="20"/>
-              </w:rPr>
-            </w:pPr>
-            <w:r>
-              <w:rPr>
-                <w:sz w:val="20"/>
-                <w:szCs w:val="20"/>
-              </w:rPr>
-              <w:t xml:space="preserve">If a client </w:t>
-            </w:r>
-            <w:proofErr w:type="spellStart"/>
-            <w:r>
-              <w:rPr>
-                <w:sz w:val="20"/>
-                <w:szCs w:val="20"/>
-              </w:rPr>
-              <w:t>resquets</w:t>
-            </w:r>
-            <w:proofErr w:type="spellEnd"/>
-            <w:r>
-              <w:rPr>
-                <w:sz w:val="20"/>
-                <w:szCs w:val="20"/>
-              </w:rPr>
-              <w:t xml:space="preserve"> that the caterer </w:t>
-            </w:r>
-            <w:proofErr w:type="gramStart"/>
-            <w:r>
-              <w:rPr>
-                <w:sz w:val="20"/>
-                <w:szCs w:val="20"/>
-              </w:rPr>
-              <w:t>coordinate</w:t>
-            </w:r>
-            <w:proofErr w:type="gramEnd"/>
-            <w:r>
-              <w:rPr>
-                <w:sz w:val="20"/>
-                <w:szCs w:val="20"/>
-              </w:rPr>
-              <w:t xml:space="preserve"> the venue rental &amp; décor, entertainment, photography, valet parking, flower arranging, or other aspects of planning the event, there will be a small fee charged for this service to account for the labor needed to plan the event as agreed upon in writing by the parties at the time of such request.</w:t>
-            </w:r>
-          </w:p>
-          <w:p>
-            <w:pPr>
-              <w:rPr>
-                <w:b/>
-                <w:bCs/>
-                <w:sz w:val="20"/>
-                <w:szCs w:val="20"/>
-              </w:rPr>
-            </w:pPr>
-            <w:r>
-              <w:rPr>
-                <w:b/>
-                <w:bCs/>
-                <w:sz w:val="20"/>
-                <w:szCs w:val="20"/>
-              </w:rPr>
-              <w:t>Delivery Fee</w:t>
-            </w:r>
-          </w:p>
-          <w:p>
-            <w:pPr>
-              <w:rPr>
-                <w:sz w:val="20"/>
-                <w:szCs w:val="20"/>
-              </w:rPr>
-            </w:pPr>
-            <w:r>
-              <w:rPr>
-                <w:sz w:val="20"/>
-                <w:szCs w:val="20"/>
-              </w:rPr>
-              <w:t>Not Applicable</w:t>
-            </w:r>
-          </w:p>
-          <w:p>
-            <w:pPr>
-              <w:rPr>
-                <w:b/>
-                <w:bCs/>
-                <w:sz w:val="20"/>
-                <w:szCs w:val="20"/>
-              </w:rPr>
-            </w:pPr>
-            <w:r>
-              <w:rPr>
-                <w:b/>
-                <w:bCs/>
-                <w:sz w:val="20"/>
-                <w:szCs w:val="20"/>
-              </w:rPr>
-              <w:t>Service Charge</w:t>
-            </w:r>
-          </w:p>
-          <w:p>
-            <w:pPr>
-              <w:jc w:val="both"/>
-              <w:rPr>
-                <w:sz w:val="20"/>
-                <w:szCs w:val="20"/>
-              </w:rPr>
-            </w:pPr>
-            <w:r>
-              <w:rPr>
-                <w:sz w:val="20"/>
-                <w:szCs w:val="20"/>
-              </w:rPr>
-              <w:t>A service charge of 18,00 % is Indicated in your proposal of service.</w:t>
-            </w:r>
-            <w:r>
-              <w:rPr>
-                <w:sz w:val="20"/>
-                <w:szCs w:val="20"/>
-              </w:rPr>
-              <w:t xml:space="preserve"> </w:t>
-            </w:r>
-            <w:r>
-              <w:rPr>
-                <w:sz w:val="20"/>
-                <w:szCs w:val="20"/>
-              </w:rPr>
-              <w:t>This fee covers all administration, insurance fees, transportation, site visits, trucking, &amp; supplemental costs associated with the event planning.</w:t>
-            </w:r>
-          </w:p>
-          <w:p>
-            <w:pPr>
-              <w:rPr>
-                <w:b/>
-                <w:bCs/>
-                <w:sz w:val="20"/>
-                <w:szCs w:val="20"/>
-              </w:rPr>
-            </w:pPr>
-            <w:r>
-              <w:rPr>
-                <w:b/>
-                <w:bCs/>
-                <w:sz w:val="20"/>
-                <w:szCs w:val="20"/>
-              </w:rPr>
-              <w:t>Gratuities</w:t>
-            </w:r>
-          </w:p>
-          <w:p>
-            <w:pPr>
-              <w:jc w:val="both"/>
-              <w:rPr>
-                <w:sz w:val="20"/>
-                <w:szCs w:val="20"/>
-              </w:rPr>
-            </w:pPr>
-            <w:r>
-              <w:rPr>
-                <w:sz w:val="20"/>
-                <w:szCs w:val="20"/>
-              </w:rPr>
-              <w:t>Gratuities are not included in the proposal and are at the sole discretion of the client.</w:t>
-            </w:r>
-          </w:p>
-          <w:p>
-            <w:pPr>
-              <w:rPr>
-                <w:b/>
-                <w:bCs/>
-                <w:sz w:val="20"/>
-                <w:szCs w:val="20"/>
-              </w:rPr>
-            </w:pPr>
-            <w:r>
-              <w:rPr>
-                <w:b/>
-                <w:bCs/>
-                <w:sz w:val="20"/>
-                <w:szCs w:val="20"/>
-              </w:rPr>
-              <w:t>Taxes and Insurance</w:t>
-            </w:r>
-          </w:p>
-          <w:p>
-            <w:pPr>
-              <w:rPr>
-                <w:sz w:val="20"/>
-                <w:szCs w:val="20"/>
-              </w:rPr>
-            </w:pPr>
-            <w:r>
-              <w:rPr>
-                <w:sz w:val="20"/>
-                <w:szCs w:val="20"/>
-              </w:rPr>
-              <w:t>All prices are subject to a 18,00 % service and</w:t>
-            </w:r>
-          </w:p>
-          <w:p>
-            <w:pPr>
-              <w:rPr>
-                <w:b/>
-                <w:bCs/>
-                <w:sz w:val="20"/>
-                <w:szCs w:val="20"/>
-              </w:rPr>
-            </w:pPr>
-            <w:r>
-              <w:rPr>
-                <w:b/>
-                <w:bCs/>
-                <w:sz w:val="20"/>
-                <w:szCs w:val="20"/>
-              </w:rPr>
-              <w:t>Governing Terms</w:t>
-            </w:r>
-          </w:p>
-          <w:p>
-            <w:pPr>
-              <w:jc w:val="both"/>
-              <w:rPr>
-                <w:sz w:val="20"/>
-                <w:szCs w:val="20"/>
-              </w:rPr>
-            </w:pPr>
-            <w:proofErr w:type="spellStart"/>
-            <w:r>
-              <w:rPr>
-                <w:sz w:val="20"/>
-                <w:szCs w:val="20"/>
-              </w:rPr>
-              <w:t>Foodesign</w:t>
-            </w:r>
-            <w:proofErr w:type="spellEnd"/>
-            <w:r>
-              <w:rPr>
-                <w:sz w:val="20"/>
-                <w:szCs w:val="20"/>
-              </w:rPr>
-              <w:t xml:space="preserve"> Conceptual Events and the Client acknowledge and agree that this proposal is governed by the Master Caterer Agreement executed between the parties.</w:t>
-            </w:r>
-          </w:p>
-          <w:p>
-            <w:pPr>
-              <w:rPr>
-                <w:b/>
-                <w:bCs/>
-                <w:sz w:val="20"/>
-                <w:szCs w:val="20"/>
-              </w:rPr>
-            </w:pPr>
-            <w:r>
-              <w:rPr>
-                <w:b/>
-                <w:bCs/>
-                <w:sz w:val="20"/>
-                <w:szCs w:val="20"/>
-              </w:rPr>
-              <w:t>Acceptance By Client</w:t>
-            </w:r>
-          </w:p>
-          <w:p>
-            <w:pPr>
-              <w:jc w:val="both"/>
-              <w:rPr>
-                <w:sz w:val="20"/>
-                <w:szCs w:val="20"/>
-              </w:rPr>
-            </w:pPr>
-            <w:r>
-              <w:rPr>
-                <w:sz w:val="20"/>
-                <w:szCs w:val="20"/>
-              </w:rPr>
-              <w:t xml:space="preserve">The undersigned, as a duly authorized representative of the Client, Math for America, hereby contract the services of </w:t>
-            </w:r>
-            <w:proofErr w:type="spellStart"/>
-            <w:r>
-              <w:rPr>
-                <w:sz w:val="20"/>
-                <w:szCs w:val="20"/>
-              </w:rPr>
-              <w:t>Foodesign</w:t>
-            </w:r>
-            <w:proofErr w:type="spellEnd"/>
-            <w:r>
-              <w:rPr>
-                <w:sz w:val="20"/>
-                <w:szCs w:val="20"/>
-              </w:rPr>
-              <w:t xml:space="preserve"> Conceptual Events as listed and quoted in this proposal on behalf of the Client according to the terms and conditions herein.</w:t>
-            </w:r>
-          </w:p>
-          <w:p>
-            <w:pPr>
-              <w:jc w:val="both"/>
-              <w:rPr>
-                <w:b/>
-                <w:bCs/>
-                <w:sz w:val="28"/>
-                <w:szCs w:val="28"/>
-              </w:rPr>
-            </w:pPr>
-            <w:r>
-              <w:rPr>
-                <w:b/>
-                <w:bCs/>
-                <w:sz w:val="28"/>
-                <w:szCs w:val="28"/>
-              </w:rPr>
-              <w:t>Signed: _______________________________</w:t>
-            </w:r>
-          </w:p>
-          <w:p>
-            <w:pPr>
-              <w:jc w:val="both"/>
-              <w:rPr>
-                <w:b/>
-                <w:bCs/>
-                <w:sz w:val="28"/>
-                <w:szCs w:val="28"/>
-              </w:rPr>
-            </w:pPr>
-            <w:r>
-              <w:rPr>
-                <w:b/>
-                <w:bCs/>
-                <w:sz w:val="28"/>
-                <w:szCs w:val="28"/>
-              </w:rPr>
-              <w:t>Name: ________________________________</w:t>
-            </w:r>
-          </w:p>
-          <w:p>
-            <w:pPr>
-              <w:jc w:val="both"/>
-              <w:rPr>
-                <w:b/>
-                <w:bCs/>
-                <w:sz w:val="28"/>
-                <w:szCs w:val="28"/>
-              </w:rPr>
-            </w:pPr>
-            <w:r>
-              <w:rPr>
-                <w:b/>
-                <w:bCs/>
-                <w:sz w:val="28"/>
-                <w:szCs w:val="28"/>
-              </w:rPr>
-              <w:t>Data: _________________________________</w:t>
-            </w:r>
-          </w:p>
-        </w:tc>
-      </w:tr>
-    </w:tbl>
+    <w:p>
+      <w:pPr>
+        <w:spacing w:after="0" w:line="240" w:lineRule="auto"/>
+      </w:pPr>
+      <w:r>
+        <w:br w:type="page"/>
+      </w:r>
+    </w:p>
+    <w:p>
+      <w:pPr>
+        <w:rPr>
+          <w:b/>
+          <w:color w:val="612D4B"/>
+          <w:sz w:val="24"/>
+        </w:rPr>
+      </w:pPr>
+      <w:r>
+        <w:rPr>
+          <w:b/>
+          <w:color w:val="612D4B"/>
+          <w:sz w:val="24"/>
+        </w:rPr>
+        <w:lastRenderedPageBreak/>
+        <w:t>Explanation of Fees</w:t>
+      </w:r>
+    </w:p>
+    <w:p>
+      <w:pPr>
+        <w:rPr>
+          <w:b/>
+          <w:bCs/>
+          <w:sz w:val="20"/>
+          <w:szCs w:val="20"/>
+        </w:rPr>
+      </w:pPr>
+      <w:r>
+        <w:rPr>
+          <w:b/>
+          <w:bCs/>
+          <w:sz w:val="20"/>
+          <w:szCs w:val="20"/>
+        </w:rPr>
+        <w:t>Event Planning Service</w:t>
+      </w:r>
+    </w:p>
+    <w:p>
+      <w:pPr>
+        <w:jc w:val="both"/>
+        <w:rPr>
+          <w:sz w:val="20"/>
+          <w:szCs w:val="20"/>
+        </w:rPr>
+      </w:pPr>
+      <w:r>
+        <w:rPr>
+          <w:sz w:val="20"/>
+          <w:szCs w:val="20"/>
+        </w:rPr>
+        <w:t xml:space="preserve">If a client </w:t>
+      </w:r>
+      <w:proofErr w:type="spellStart"/>
+      <w:r>
+        <w:rPr>
+          <w:sz w:val="20"/>
+          <w:szCs w:val="20"/>
+        </w:rPr>
+        <w:t>resquets</w:t>
+      </w:r>
+      <w:proofErr w:type="spellEnd"/>
+      <w:r>
+        <w:rPr>
+          <w:sz w:val="20"/>
+          <w:szCs w:val="20"/>
+        </w:rPr>
+        <w:t xml:space="preserve"> that the caterer coordinate the venue rental &amp; décor, entertainment, photography, valet parking, flower arranging, or other aspects of planning the event, there will be a small fee charged for this service to account for the labor needed to plan the event as agreed upon in writing by the parties at the time of such request.</w:t>
+      </w:r>
+    </w:p>
+    <w:p>
+      <w:pPr>
+        <w:rPr>
+          <w:b/>
+          <w:bCs/>
+          <w:sz w:val="20"/>
+          <w:szCs w:val="20"/>
+        </w:rPr>
+      </w:pPr>
+      <w:r>
+        <w:rPr>
+          <w:b/>
+          <w:bCs/>
+          <w:sz w:val="20"/>
+          <w:szCs w:val="20"/>
+        </w:rPr>
+        <w:t>Delivery Fee</w:t>
+      </w:r>
+    </w:p>
+    <w:p>
+      <w:pPr>
+        <w:rPr>
+          <w:sz w:val="20"/>
+          <w:szCs w:val="20"/>
+        </w:rPr>
+      </w:pPr>
+      <w:r>
+        <w:rPr>
+          <w:sz w:val="20"/>
+          <w:szCs w:val="20"/>
+        </w:rPr>
+        <w:t>Not Applicable</w:t>
+      </w:r>
+    </w:p>
+    <w:p>
+      <w:pPr>
+        <w:rPr>
+          <w:b/>
+          <w:bCs/>
+          <w:sz w:val="20"/>
+          <w:szCs w:val="20"/>
+        </w:rPr>
+      </w:pPr>
+      <w:r>
+        <w:rPr>
+          <w:b/>
+          <w:bCs/>
+          <w:sz w:val="20"/>
+          <w:szCs w:val="20"/>
+        </w:rPr>
+        <w:t>Service Charge</w:t>
+      </w:r>
+    </w:p>
+    <w:p>
+      <w:pPr>
+        <w:jc w:val="both"/>
+        <w:rPr>
+          <w:sz w:val="20"/>
+          <w:szCs w:val="20"/>
+        </w:rPr>
+      </w:pPr>
+      <w:r>
+        <w:rPr>
+          <w:sz w:val="20"/>
+          <w:szCs w:val="20"/>
+        </w:rPr>
+        <w:t>A service charge of 18,00 % is Indicated in your proposal of service.</w:t>
+      </w:r>
+      <w:r>
+        <w:rPr>
+          <w:sz w:val="20"/>
+          <w:szCs w:val="20"/>
+        </w:rPr>
+        <w:t xml:space="preserve"> </w:t>
+      </w:r>
+      <w:r>
+        <w:rPr>
+          <w:sz w:val="20"/>
+          <w:szCs w:val="20"/>
+        </w:rPr>
+        <w:t>This fee covers all administration, insurance fees, transportation, site visits, trucking, &amp; supplemental costs associated with the event planning.</w:t>
+      </w:r>
+    </w:p>
+    <w:p>
+      <w:pPr>
+        <w:rPr>
+          <w:b/>
+          <w:bCs/>
+          <w:sz w:val="20"/>
+          <w:szCs w:val="20"/>
+        </w:rPr>
+      </w:pPr>
+      <w:r>
+        <w:rPr>
+          <w:b/>
+          <w:bCs/>
+          <w:sz w:val="20"/>
+          <w:szCs w:val="20"/>
+        </w:rPr>
+        <w:t>Gratuities</w:t>
+      </w:r>
+    </w:p>
+    <w:p>
+      <w:pPr>
+        <w:jc w:val="both"/>
+        <w:rPr>
+          <w:sz w:val="20"/>
+          <w:szCs w:val="20"/>
+        </w:rPr>
+      </w:pPr>
+      <w:r>
+        <w:rPr>
+          <w:sz w:val="20"/>
+          <w:szCs w:val="20"/>
+        </w:rPr>
+        <w:t>Gratuities are not included in the proposal and are at the sole discretion of the client.</w:t>
+      </w:r>
+    </w:p>
+    <w:p>
+      <w:pPr>
+        <w:rPr>
+          <w:b/>
+          <w:bCs/>
+          <w:sz w:val="20"/>
+          <w:szCs w:val="20"/>
+        </w:rPr>
+      </w:pPr>
+      <w:r>
+        <w:rPr>
+          <w:b/>
+          <w:bCs/>
+          <w:sz w:val="20"/>
+          <w:szCs w:val="20"/>
+        </w:rPr>
+        <w:t>Taxes and Insurance</w:t>
+      </w:r>
+    </w:p>
+    <w:p>
+      <w:pPr>
+        <w:rPr>
+          <w:sz w:val="20"/>
+          <w:szCs w:val="20"/>
+        </w:rPr>
+      </w:pPr>
+      <w:r>
+        <w:rPr>
+          <w:sz w:val="20"/>
+          <w:szCs w:val="20"/>
+        </w:rPr>
+        <w:t>All prices are subject to a 18,00 % service and</w:t>
+      </w:r>
+    </w:p>
+    <w:p>
+      <w:pPr>
+        <w:rPr>
+          <w:b/>
+          <w:bCs/>
+          <w:sz w:val="20"/>
+          <w:szCs w:val="20"/>
+        </w:rPr>
+      </w:pPr>
+      <w:r>
+        <w:rPr>
+          <w:b/>
+          <w:bCs/>
+          <w:sz w:val="20"/>
+          <w:szCs w:val="20"/>
+        </w:rPr>
+        <w:t>Governing Terms</w:t>
+      </w:r>
+    </w:p>
+    <w:p>
+      <w:pPr>
+        <w:jc w:val="both"/>
+        <w:rPr>
+          <w:sz w:val="20"/>
+          <w:szCs w:val="20"/>
+        </w:rPr>
+      </w:pPr>
+      <w:proofErr w:type="spellStart"/>
+      <w:r>
+        <w:rPr>
+          <w:sz w:val="20"/>
+          <w:szCs w:val="20"/>
+        </w:rPr>
+        <w:t>Foodesign</w:t>
+      </w:r>
+      <w:proofErr w:type="spellEnd"/>
+      <w:r>
+        <w:rPr>
+          <w:sz w:val="20"/>
+          <w:szCs w:val="20"/>
+        </w:rPr>
+        <w:t xml:space="preserve"> Conceptual Events and the Client acknowledge and agree that this proposal is governed by the Master Caterer Agreement executed between the parties.</w:t>
+      </w:r>
+    </w:p>
+    <w:p>
+      <w:pPr>
+        <w:rPr>
+          <w:b/>
+          <w:bCs/>
+          <w:sz w:val="20"/>
+          <w:szCs w:val="20"/>
+        </w:rPr>
+      </w:pPr>
+      <w:r>
+        <w:rPr>
+          <w:b/>
+          <w:bCs/>
+          <w:sz w:val="20"/>
+          <w:szCs w:val="20"/>
+        </w:rPr>
+        <w:t>Acceptance By Client</w:t>
+      </w:r>
+    </w:p>
+    <w:p>
+      <w:pPr>
+        <w:jc w:val="both"/>
+        <w:rPr>
+          <w:sz w:val="20"/>
+          <w:szCs w:val="20"/>
+        </w:rPr>
+      </w:pPr>
+      <w:r>
+        <w:rPr>
+          <w:sz w:val="20"/>
+          <w:szCs w:val="20"/>
+        </w:rPr>
+        <w:t xml:space="preserve">The undersigned, as a duly authorized representative of the Client, Math for America, hereby contract the services of </w:t>
+      </w:r>
+      <w:proofErr w:type="spellStart"/>
+      <w:r>
+        <w:rPr>
+          <w:sz w:val="20"/>
+          <w:szCs w:val="20"/>
+        </w:rPr>
+        <w:t>Foodesign</w:t>
+      </w:r>
+      <w:proofErr w:type="spellEnd"/>
+      <w:r>
+        <w:rPr>
+          <w:sz w:val="20"/>
+          <w:szCs w:val="20"/>
+        </w:rPr>
+        <w:t xml:space="preserve"> Conceptual Events as listed and quoted in this proposal on behalf of the Client according to the terms and conditions herein.</w:t>
+      </w:r>
+    </w:p>
+    <w:p>
+      <w:pPr>
+        <w:jc w:val="both"/>
+        <w:rPr>
+          <w:b/>
+          <w:bCs/>
+          <w:sz w:val="28"/>
+          <w:szCs w:val="28"/>
+        </w:rPr>
+      </w:pPr>
+      <w:r>
+        <w:rPr>
+          <w:b/>
+          <w:bCs/>
+          <w:sz w:val="28"/>
+          <w:szCs w:val="28"/>
+        </w:rPr>
+        <w:t>Signed: _______________________________</w:t>
+      </w:r>
+    </w:p>
+    <w:p>
+      <w:pPr>
+        <w:jc w:val="both"/>
+        <w:rPr>
+          <w:b/>
+          <w:bCs/>
+          <w:sz w:val="28"/>
+          <w:szCs w:val="28"/>
+        </w:rPr>
+      </w:pPr>
+      <w:r>
+        <w:rPr>
+          <w:b/>
+          <w:bCs/>
+          <w:sz w:val="28"/>
+          <w:szCs w:val="28"/>
+        </w:rPr>
+        <w:t>Name: ________________________________</w:t>
+      </w:r>
+    </w:p>
     <w:p>
       <w:pPr>
         <w:pStyle w:val="Ttulo1"/>
         <w:spacing w:before="0"/>
       </w:pPr>
+      <w:r>
+        <w:t>Data: _________________________________</w:t>
+      </w:r>
     </w:p>
+    <w:p/>
     <w:sectPr>
-      <w:headerReference w:type="even" r:id="rId9"/>
-      <w:headerReference w:type="default" r:id="rId10"/>
-      <w:footerReference w:type="even" r:id="rId11"/>
-      <w:footerReference w:type="default" r:id="rId12"/>
-      <w:headerReference w:type="first" r:id="rId13"/>
-      <w:footerReference w:type="first" r:id="rId14"/>
       <w:pgSz w:w="12240" w:h="15840"/>
-      <w:pgMar w:top="1440" w:right="1800" w:bottom="1440" w:left="1800" w:header="0" w:footer="0" w:gutter="0"/>
+      <w:pgMar w:top="1440" w:right="1800" w:bottom="1440" w:left="4608" w:header="0" w:footer="0" w:gutter="0"/>
       <w:cols w:space="720"/>
       <w:formProt w:val="0"/>
-      <w:titlePg/>
       <w:docGrid w:linePitch="360" w:charSpace="4096"/>
     </w:sectPr>
   </w:body>
@@ -952,36 +839,6 @@
     </w:p>
   </w:endnote>
 </w:endnotes>
-</file>
-
-<file path=word/footer1.xml><?xml version="1.0" encoding="utf-8"?>
-<w:ftr xmlns:wpc="http://schemas.microsoft.com/office/word/2010/wordprocessingCanvas" xmlns:cx="http://schemas.microsoft.com/office/drawing/2014/chartex" xmlns:cx1="http://schemas.microsoft.com/office/drawing/2015/9/8/chartex" xmlns:cx2="http://schemas.microsoft.com/office/drawing/2015/10/21/chartex" xmlns:cx3="http://schemas.microsoft.com/office/drawing/2016/5/9/chartex" xmlns:cx4="http://schemas.microsoft.com/office/drawing/2016/5/10/chartex" xmlns:cx5="http://schemas.microsoft.com/office/drawing/2016/5/11/chartex" xmlns:cx6="http://schemas.microsoft.com/office/drawing/2016/5/12/chartex" xmlns:cx7="http://schemas.microsoft.com/office/drawing/2016/5/13/chartex" xmlns:cx8="http://schemas.microsoft.com/office/drawing/2016/5/14/chartex" xmlns:mc="http://schemas.openxmlformats.org/markup-compatibility/2006" xmlns:aink="http://schemas.microsoft.com/office/drawing/2016/ink" xmlns:am3d="http://schemas.microsoft.com/office/drawing/2017/model3d" xmlns:o="urn:schemas-microsoft-com:office:office" xmlns:oel="http://schemas.microsoft.com/office/2019/extlst" xmlns:r="http://schemas.openxmlformats.org/officeDocument/2006/relationships" xmlns:m="http://schemas.openxmlformats.org/officeDocument/2006/math" xmlns:v="urn:schemas-microsoft-com:vml" xmlns:wp14="http://schemas.microsoft.com/office/word/2010/wordprocessingDrawing" xmlns:wp="http://schemas.openxmlformats.org/drawingml/2006/wordprocessingDrawing" xmlns:w10="urn:schemas-microsoft-com:office:word" xmlns:w="http://schemas.openxmlformats.org/wordprocessingml/2006/main" xmlns:w14="http://schemas.microsoft.com/office/word/2010/wordml" xmlns:w15="http://schemas.microsoft.com/office/word/2012/wordml" xmlns:w16cex="http://schemas.microsoft.com/office/word/2018/wordml/cex" xmlns:w16cid="http://schemas.microsoft.com/office/word/2016/wordml/cid" xmlns:w16="http://schemas.microsoft.com/office/word/2018/wordml" xmlns:w16du="http://schemas.microsoft.com/office/word/2023/wordml/word16du" xmlns:w16sdtdh="http://schemas.microsoft.com/office/word/2020/wordml/sdtdatahash" xmlns:w16sdtfl="http://schemas.microsoft.com/office/word/2024/wordml/sdtformatlock" xmlns:w16se="http://schemas.microsoft.com/office/word/2015/wordml/symex" xmlns:wpg="http://schemas.microsoft.com/office/word/2010/wordprocessingGroup" xmlns:wpi="http://schemas.microsoft.com/office/word/2010/wordprocessingInk" xmlns:wne="http://schemas.microsoft.com/office/word/2006/wordml" xmlns:wps="http://schemas.microsoft.com/office/word/2010/wordprocessingShape" mc:Ignorable="w14 w15 w16se w16cid w16 w16cex w16sdtdh w16sdtfl w16du wp14">
-  <w:p>
-    <w:pPr>
-      <w:pStyle w:val="Piedepgina"/>
-    </w:pPr>
-  </w:p>
-</w:ftr>
-</file>
-
-<file path=word/footer2.xml><?xml version="1.0" encoding="utf-8"?>
-<w:ftr xmlns:wpc="http://schemas.microsoft.com/office/word/2010/wordprocessingCanvas" xmlns:cx="http://schemas.microsoft.com/office/drawing/2014/chartex" xmlns:cx1="http://schemas.microsoft.com/office/drawing/2015/9/8/chartex" xmlns:cx2="http://schemas.microsoft.com/office/drawing/2015/10/21/chartex" xmlns:cx3="http://schemas.microsoft.com/office/drawing/2016/5/9/chartex" xmlns:cx4="http://schemas.microsoft.com/office/drawing/2016/5/10/chartex" xmlns:cx5="http://schemas.microsoft.com/office/drawing/2016/5/11/chartex" xmlns:cx6="http://schemas.microsoft.com/office/drawing/2016/5/12/chartex" xmlns:cx7="http://schemas.microsoft.com/office/drawing/2016/5/13/chartex" xmlns:cx8="http://schemas.microsoft.com/office/drawing/2016/5/14/chartex" xmlns:mc="http://schemas.openxmlformats.org/markup-compatibility/2006" xmlns:aink="http://schemas.microsoft.com/office/drawing/2016/ink" xmlns:am3d="http://schemas.microsoft.com/office/drawing/2017/model3d" xmlns:o="urn:schemas-microsoft-com:office:office" xmlns:oel="http://schemas.microsoft.com/office/2019/extlst" xmlns:r="http://schemas.openxmlformats.org/officeDocument/2006/relationships" xmlns:m="http://schemas.openxmlformats.org/officeDocument/2006/math" xmlns:v="urn:schemas-microsoft-com:vml" xmlns:wp14="http://schemas.microsoft.com/office/word/2010/wordprocessingDrawing" xmlns:wp="http://schemas.openxmlformats.org/drawingml/2006/wordprocessingDrawing" xmlns:w10="urn:schemas-microsoft-com:office:word" xmlns:w="http://schemas.openxmlformats.org/wordprocessingml/2006/main" xmlns:w14="http://schemas.microsoft.com/office/word/2010/wordml" xmlns:w15="http://schemas.microsoft.com/office/word/2012/wordml" xmlns:w16cex="http://schemas.microsoft.com/office/word/2018/wordml/cex" xmlns:w16cid="http://schemas.microsoft.com/office/word/2016/wordml/cid" xmlns:w16="http://schemas.microsoft.com/office/word/2018/wordml" xmlns:w16du="http://schemas.microsoft.com/office/word/2023/wordml/word16du" xmlns:w16sdtdh="http://schemas.microsoft.com/office/word/2020/wordml/sdtdatahash" xmlns:w16sdtfl="http://schemas.microsoft.com/office/word/2024/wordml/sdtformatlock" xmlns:w16se="http://schemas.microsoft.com/office/word/2015/wordml/symex" xmlns:wpg="http://schemas.microsoft.com/office/word/2010/wordprocessingGroup" xmlns:wpi="http://schemas.microsoft.com/office/word/2010/wordprocessingInk" xmlns:wne="http://schemas.microsoft.com/office/word/2006/wordml" xmlns:wps="http://schemas.microsoft.com/office/word/2010/wordprocessingShape" mc:Ignorable="w14 w15 w16se w16cid w16 w16cex w16sdtdh w16sdtfl w16du wp14">
-  <w:p>
-    <w:pPr>
-      <w:pStyle w:val="Piedepgina"/>
-    </w:pPr>
-  </w:p>
-</w:ftr>
-</file>
-
-<file path=word/footer3.xml><?xml version="1.0" encoding="utf-8"?>
-<w:ftr xmlns:wpc="http://schemas.microsoft.com/office/word/2010/wordprocessingCanvas" xmlns:cx="http://schemas.microsoft.com/office/drawing/2014/chartex" xmlns:cx1="http://schemas.microsoft.com/office/drawing/2015/9/8/chartex" xmlns:cx2="http://schemas.microsoft.com/office/drawing/2015/10/21/chartex" xmlns:cx3="http://schemas.microsoft.com/office/drawing/2016/5/9/chartex" xmlns:cx4="http://schemas.microsoft.com/office/drawing/2016/5/10/chartex" xmlns:cx5="http://schemas.microsoft.com/office/drawing/2016/5/11/chartex" xmlns:cx6="http://schemas.microsoft.com/office/drawing/2016/5/12/chartex" xmlns:cx7="http://schemas.microsoft.com/office/drawing/2016/5/13/chartex" xmlns:cx8="http://schemas.microsoft.com/office/drawing/2016/5/14/chartex" xmlns:mc="http://schemas.openxmlformats.org/markup-compatibility/2006" xmlns:aink="http://schemas.microsoft.com/office/drawing/2016/ink" xmlns:am3d="http://schemas.microsoft.com/office/drawing/2017/model3d" xmlns:o="urn:schemas-microsoft-com:office:office" xmlns:oel="http://schemas.microsoft.com/office/2019/extlst" xmlns:r="http://schemas.openxmlformats.org/officeDocument/2006/relationships" xmlns:m="http://schemas.openxmlformats.org/officeDocument/2006/math" xmlns:v="urn:schemas-microsoft-com:vml" xmlns:wp14="http://schemas.microsoft.com/office/word/2010/wordprocessingDrawing" xmlns:wp="http://schemas.openxmlformats.org/drawingml/2006/wordprocessingDrawing" xmlns:w10="urn:schemas-microsoft-com:office:word" xmlns:w="http://schemas.openxmlformats.org/wordprocessingml/2006/main" xmlns:w14="http://schemas.microsoft.com/office/word/2010/wordml" xmlns:w15="http://schemas.microsoft.com/office/word/2012/wordml" xmlns:w16cex="http://schemas.microsoft.com/office/word/2018/wordml/cex" xmlns:w16cid="http://schemas.microsoft.com/office/word/2016/wordml/cid" xmlns:w16="http://schemas.microsoft.com/office/word/2018/wordml" xmlns:w16du="http://schemas.microsoft.com/office/word/2023/wordml/word16du" xmlns:w16sdtdh="http://schemas.microsoft.com/office/word/2020/wordml/sdtdatahash" xmlns:w16sdtfl="http://schemas.microsoft.com/office/word/2024/wordml/sdtformatlock" xmlns:w16se="http://schemas.microsoft.com/office/word/2015/wordml/symex" xmlns:wpg="http://schemas.microsoft.com/office/word/2010/wordprocessingGroup" xmlns:wpi="http://schemas.microsoft.com/office/word/2010/wordprocessingInk" xmlns:wne="http://schemas.microsoft.com/office/word/2006/wordml" xmlns:wps="http://schemas.microsoft.com/office/word/2010/wordprocessingShape" mc:Ignorable="w14 w15 w16se w16cid w16 w16cex w16sdtdh w16sdtfl w16du wp14">
-  <w:p>
-    <w:pPr>
-      <w:pStyle w:val="Piedepgina"/>
-    </w:pPr>
-  </w:p>
-</w:ftr>
 </file>
 
 <file path=word/footnotes.xml><?xml version="1.0" encoding="utf-8"?>
@@ -1015,16 +872,6 @@
     <w:pPr>
       <w:pStyle w:val="Encabezado"/>
     </w:pPr>
-  </w:p>
-</w:hdr>
-</file>
-
-<file path=word/header2.xml><?xml version="1.0" encoding="utf-8"?>
-<w:hdr xmlns:wpc="http://schemas.microsoft.com/office/word/2010/wordprocessingCanvas" xmlns:cx="http://schemas.microsoft.com/office/drawing/2014/chartex" xmlns:cx1="http://schemas.microsoft.com/office/drawing/2015/9/8/chartex" xmlns:cx2="http://schemas.microsoft.com/office/drawing/2015/10/21/chartex" xmlns:cx3="http://schemas.microsoft.com/office/drawing/2016/5/9/chartex" xmlns:cx4="http://schemas.microsoft.com/office/drawing/2016/5/10/chartex" xmlns:cx5="http://schemas.microsoft.com/office/drawing/2016/5/11/chartex" xmlns:cx6="http://schemas.microsoft.com/office/drawing/2016/5/12/chartex" xmlns:cx7="http://schemas.microsoft.com/office/drawing/2016/5/13/chartex" xmlns:cx8="http://schemas.microsoft.com/office/drawing/2016/5/14/chartex" xmlns:mc="http://schemas.openxmlformats.org/markup-compatibility/2006" xmlns:aink="http://schemas.microsoft.com/office/drawing/2016/ink" xmlns:am3d="http://schemas.microsoft.com/office/drawing/2017/model3d" xmlns:o="urn:schemas-microsoft-com:office:office" xmlns:oel="http://schemas.microsoft.com/office/2019/extlst" xmlns:r="http://schemas.openxmlformats.org/officeDocument/2006/relationships" xmlns:m="http://schemas.openxmlformats.org/officeDocument/2006/math" xmlns:v="urn:schemas-microsoft-com:vml" xmlns:wp14="http://schemas.microsoft.com/office/word/2010/wordprocessingDrawing" xmlns:wp="http://schemas.openxmlformats.org/drawingml/2006/wordprocessingDrawing" xmlns:w10="urn:schemas-microsoft-com:office:word" xmlns:w="http://schemas.openxmlformats.org/wordprocessingml/2006/main" xmlns:w14="http://schemas.microsoft.com/office/word/2010/wordml" xmlns:w15="http://schemas.microsoft.com/office/word/2012/wordml" xmlns:w16cex="http://schemas.microsoft.com/office/word/2018/wordml/cex" xmlns:w16cid="http://schemas.microsoft.com/office/word/2016/wordml/cid" xmlns:w16="http://schemas.microsoft.com/office/word/2018/wordml" xmlns:w16du="http://schemas.microsoft.com/office/word/2023/wordml/word16du" xmlns:w16sdtdh="http://schemas.microsoft.com/office/word/2020/wordml/sdtdatahash" xmlns:w16sdtfl="http://schemas.microsoft.com/office/word/2024/wordml/sdtformatlock" xmlns:w16se="http://schemas.microsoft.com/office/word/2015/wordml/symex" xmlns:wpg="http://schemas.microsoft.com/office/word/2010/wordprocessingGroup" xmlns:wpi="http://schemas.microsoft.com/office/word/2010/wordprocessingInk" xmlns:wne="http://schemas.microsoft.com/office/word/2006/wordml" xmlns:wps="http://schemas.microsoft.com/office/word/2010/wordprocessingShape" mc:Ignorable="w14 w15 w16se w16cid w16 w16cex w16sdtdh w16sdtfl w16du wp14">
-  <w:p>
-    <w:pPr>
-      <w:pStyle w:val="Encabezado"/>
-    </w:pPr>
     <w:r>
       <w:rPr>
         <w:noProof/>
@@ -1032,16 +879,16 @@
       <mc:AlternateContent>
         <mc:Choice Requires="wps">
           <w:drawing>
-            <wp:anchor distT="0" distB="0" distL="114300" distR="114300" simplePos="0" relativeHeight="251659264" behindDoc="1" locked="0" layoutInCell="1" allowOverlap="1" wp14:anchorId="33E41B47" wp14:editId="28A2B0BF">
+            <wp:anchor distT="0" distB="0" distL="114300" distR="114300" simplePos="0" relativeHeight="251659264" behindDoc="1" locked="0" layoutInCell="1" allowOverlap="1" wp14:anchorId="33E41B47" wp14:editId="08AB9E1A">
               <wp:simplePos x="0" y="0"/>
-              <wp:positionH relativeFrom="column">
-                <wp:posOffset>-38100</wp:posOffset>
+              <wp:positionH relativeFrom="page">
+                <wp:posOffset>457200</wp:posOffset>
               </wp:positionH>
-              <wp:positionV relativeFrom="paragraph">
-                <wp:posOffset>228600</wp:posOffset>
+              <wp:positionV relativeFrom="page">
+                <wp:posOffset>0</wp:posOffset>
               </wp:positionV>
-              <wp:extent cx="2095500" cy="8705850"/>
-              <wp:effectExtent l="0" t="0" r="0" b="0"/>
+              <wp:extent cx="2093976" cy="8705088"/>
+              <wp:effectExtent l="0" t="0" r="1905" b="1270"/>
               <wp:wrapNone/>
               <wp:docPr id="73020014" name="Rectángulo 1"/>
               <wp:cNvGraphicFramePr/>
@@ -1052,7 +899,7 @@
                     <wps:spPr>
                       <a:xfrm>
                         <a:off x="0" y="0"/>
-                        <a:ext cx="2095500" cy="8705850"/>
+                        <a:ext cx="2093976" cy="8705088"/>
                       </a:xfrm>
                       <a:prstGeom prst="rect">
                         <a:avLst/>
@@ -1083,7 +930,7 @@
                               <wp:inline distT="0" distB="0" distL="0" distR="0" wp14:anchorId="76F10CED" wp14:editId="1889C52E">
                                 <wp:extent cx="2397760" cy="1035685"/>
                                 <wp:effectExtent l="0" t="0" r="0" b="0"/>
-                                <wp:docPr id="2071678277" name="Imagen 2071678277"/>
+                                <wp:docPr id="1777830839" name="Imagen 1777830839"/>
                                 <wp:cNvGraphicFramePr>
                                   <a:graphicFrameLocks xmlns:a="http://schemas.openxmlformats.org/drawingml/2006/main" noChangeAspect="1"/>
                                 </wp:cNvGraphicFramePr>
@@ -1302,7 +1149,7 @@
                               <wp:inline distT="0" distB="0" distL="0" distR="0" wp14:anchorId="47EEC598" wp14:editId="61D17697">
                                 <wp:extent cx="1532890" cy="1261110"/>
                                 <wp:effectExtent l="0" t="0" r="0" b="0"/>
-                                <wp:docPr id="1001976319" name="Imagen 1001976319"/>
+                                <wp:docPr id="452091549" name="Imagen 452091549"/>
                                 <wp:cNvGraphicFramePr>
                                   <a:graphicFrameLocks xmlns:a="http://schemas.openxmlformats.org/drawingml/2006/main" noChangeAspect="1"/>
                                 </wp:cNvGraphicFramePr>
@@ -1349,6 +1196,9 @@
                   </wps:wsp>
                 </a:graphicData>
               </a:graphic>
+              <wp14:sizeRelH relativeFrom="margin">
+                <wp14:pctWidth>0</wp14:pctWidth>
+              </wp14:sizeRelH>
               <wp14:sizeRelV relativeFrom="margin">
                 <wp14:pctHeight>0</wp14:pctHeight>
               </wp14:sizeRelV>
@@ -1357,7 +1207,7 @@
         </mc:Choice>
         <mc:Fallback>
           <w:pict>
-            <v:rect w14:anchorId="33E41B47" id="Rectángulo 1" o:spid="_x0000_s1026" style="position:absolute;margin-left:-3pt;margin-top:18pt;width:165pt;height:685.5pt;z-index:-251657216;visibility:visible;mso-wrap-style:square;mso-height-percent:0;mso-wrap-distance-left:9pt;mso-wrap-distance-top:0;mso-wrap-distance-right:9pt;mso-wrap-distance-bottom:0;mso-position-horizontal:absolute;mso-position-horizontal-relative:text;mso-position-vertical:absolute;mso-position-vertical-relative:text;mso-height-percent:0;mso-height-relative:margin;v-text-anchor:middle" o:gfxdata="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" fillcolor="white [3201]" stroked="f" strokeweight="2pt">
+            <v:rect w14:anchorId="33E41B47" id="Rectángulo 1" o:spid="_x0000_s1026" style="position:absolute;margin-left:36pt;margin-top:0;width:164.9pt;height:685.45pt;z-index:-251657216;visibility:visible;mso-wrap-style:square;mso-width-percent:0;mso-height-percent:0;mso-wrap-distance-left:9pt;mso-wrap-distance-top:0;mso-wrap-distance-right:9pt;mso-wrap-distance-bottom:0;mso-position-horizontal:absolute;mso-position-horizontal-relative:page;mso-position-vertical:absolute;mso-position-vertical-relative:page;mso-width-percent:0;mso-height-percent:0;mso-width-relative:margin;mso-height-relative:margin;v-text-anchor:middle" o:gfxdata="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" fillcolor="white [3201]" stroked="f" strokeweight="2pt">
               <v:textbox>
                 <w:txbxContent>
                   <w:p>
@@ -1369,7 +1219,7 @@
                         <wp:inline distT="0" distB="0" distL="0" distR="0" wp14:anchorId="76F10CED" wp14:editId="1889C52E">
                           <wp:extent cx="2397760" cy="1035685"/>
                           <wp:effectExtent l="0" t="0" r="0" b="0"/>
-                          <wp:docPr id="2071678277" name="Imagen 2071678277"/>
+                          <wp:docPr id="1777830839" name="Imagen 1777830839"/>
                           <wp:cNvGraphicFramePr>
                             <a:graphicFrameLocks xmlns:a="http://schemas.openxmlformats.org/drawingml/2006/main" noChangeAspect="1"/>
                           </wp:cNvGraphicFramePr>
@@ -1588,7 +1438,7 @@
                         <wp:inline distT="0" distB="0" distL="0" distR="0" wp14:anchorId="47EEC598" wp14:editId="61D17697">
                           <wp:extent cx="1532890" cy="1261110"/>
                           <wp:effectExtent l="0" t="0" r="0" b="0"/>
-                          <wp:docPr id="1001976319" name="Imagen 1001976319"/>
+                          <wp:docPr id="452091549" name="Imagen 452091549"/>
                           <wp:cNvGraphicFramePr>
                             <a:graphicFrameLocks xmlns:a="http://schemas.openxmlformats.org/drawingml/2006/main" noChangeAspect="1"/>
                           </wp:cNvGraphicFramePr>
@@ -1626,21 +1476,12 @@
                   </w:p>
                 </w:txbxContent>
               </v:textbox>
+              <w10:wrap anchorx="page" anchory="page"/>
             </v:rect>
           </w:pict>
         </mc:Fallback>
       </mc:AlternateContent>
     </w:r>
-  </w:p>
-</w:hdr>
-</file>
-
-<file path=word/header3.xml><?xml version="1.0" encoding="utf-8"?>
-<w:hdr xmlns:wpc="http://schemas.microsoft.com/office/word/2010/wordprocessingCanvas" xmlns:cx="http://schemas.microsoft.com/office/drawing/2014/chartex" xmlns:cx1="http://schemas.microsoft.com/office/drawing/2015/9/8/chartex" xmlns:cx2="http://schemas.microsoft.com/office/drawing/2015/10/21/chartex" xmlns:cx3="http://schemas.microsoft.com/office/drawing/2016/5/9/chartex" xmlns:cx4="http://schemas.microsoft.com/office/drawing/2016/5/10/chartex" xmlns:cx5="http://schemas.microsoft.com/office/drawing/2016/5/11/chartex" xmlns:cx6="http://schemas.microsoft.com/office/drawing/2016/5/12/chartex" xmlns:cx7="http://schemas.microsoft.com/office/drawing/2016/5/13/chartex" xmlns:cx8="http://schemas.microsoft.com/office/drawing/2016/5/14/chartex" xmlns:mc="http://schemas.openxmlformats.org/markup-compatibility/2006" xmlns:aink="http://schemas.microsoft.com/office/drawing/2016/ink" xmlns:am3d="http://schemas.microsoft.com/office/drawing/2017/model3d" xmlns:o="urn:schemas-microsoft-com:office:office" xmlns:oel="http://schemas.microsoft.com/office/2019/extlst" xmlns:r="http://schemas.openxmlformats.org/officeDocument/2006/relationships" xmlns:m="http://schemas.openxmlformats.org/officeDocument/2006/math" xmlns:v="urn:schemas-microsoft-com:vml" xmlns:wp14="http://schemas.microsoft.com/office/word/2010/wordprocessingDrawing" xmlns:wp="http://schemas.openxmlformats.org/drawingml/2006/wordprocessingDrawing" xmlns:w10="urn:schemas-microsoft-com:office:word" xmlns:w="http://schemas.openxmlformats.org/wordprocessingml/2006/main" xmlns:w14="http://schemas.microsoft.com/office/word/2010/wordml" xmlns:w15="http://schemas.microsoft.com/office/word/2012/wordml" xmlns:w16cex="http://schemas.microsoft.com/office/word/2018/wordml/cex" xmlns:w16cid="http://schemas.microsoft.com/office/word/2016/wordml/cid" xmlns:w16="http://schemas.microsoft.com/office/word/2018/wordml" xmlns:w16du="http://schemas.microsoft.com/office/word/2023/wordml/word16du" xmlns:w16sdtdh="http://schemas.microsoft.com/office/word/2020/wordml/sdtdatahash" xmlns:w16sdtfl="http://schemas.microsoft.com/office/word/2024/wordml/sdtformatlock" xmlns:w16se="http://schemas.microsoft.com/office/word/2015/wordml/symex" xmlns:wpg="http://schemas.microsoft.com/office/word/2010/wordprocessingGroup" xmlns:wpi="http://schemas.microsoft.com/office/word/2010/wordprocessingInk" xmlns:wne="http://schemas.microsoft.com/office/word/2006/wordml" xmlns:wps="http://schemas.microsoft.com/office/word/2010/wordprocessingShape" mc:Ignorable="w14 w15 w16se w16cid w16 w16cex w16sdtdh w16sdtfl w16du wp14">
-  <w:p>
-    <w:pPr>
-      <w:pStyle w:val="Encabezado"/>
-    </w:pPr>
   </w:p>
 </w:hdr>
 </file>

</xml_diff>

<commit_message>
feat: add JSON template configuration for event estimates and update document templates
</commit_message>
<xml_diff>
--- a/estimate_template.docx
+++ b/estimate_template.docx
@@ -997,235 +997,6 @@
     </w:p>
     <w:p>
       <w:pPr>
-        <w:pStyle w:val="Ttulo1"/>
-        <w:spacing w:before="0" w:after="0"/>
-        <w:jc w:val="both"/>
-        <w:rPr>
-          <w:rFonts w:asciiTheme="minorHAnsi" w:hAnsiTheme="minorHAnsi"/>
-          <w:color w:val="501549" w:themeColor="accent5" w:themeShade="80"/>
-          <w:sz w:val="22"/>
-          <w:szCs w:val="22"/>
-          <w:lang w:val="en-US"/>
-        </w:rPr>
-      </w:pPr>
-      <w:r>
-        <w:rPr>
-          <w:rFonts w:asciiTheme="minorHAnsi" w:hAnsiTheme="minorHAnsi"/>
-          <w:color w:val="501549" w:themeColor="accent5" w:themeShade="80"/>
-          <w:sz w:val="22"/>
-          <w:szCs w:val="22"/>
-          <w:lang w:val="en-US"/>
-        </w:rPr>
-        <w:lastRenderedPageBreak/>
-        <w:t>{{CLIENT_NAME}}</w:t>
-      </w:r>
-    </w:p>
-    <w:p>
-      <w:pPr>
-        <w:spacing w:after="0"/>
-        <w:rPr>
-          <w:sz w:val="20"/>
-          <w:szCs w:val="20"/>
-          <w:lang w:val="en-US"/>
-        </w:rPr>
-      </w:pPr>
-      <w:r>
-        <w:rPr>
-          <w:sz w:val="20"/>
-          <w:szCs w:val="20"/>
-          <w:lang w:val="en-US"/>
-        </w:rPr>
-        <w:t>{{CLIENT_ADDRESS}}</w:t>
-      </w:r>
-    </w:p>
-    <w:p>
-      <w:pPr>
-        <w:spacing w:after="40"/>
-        <w:rPr>
-          <w:lang w:val="en-US"/>
-        </w:rPr>
-      </w:pPr>
-      <w:r>
-        <w:rPr>
-          <w:b/>
-          <w:bCs/>
-          <w:sz w:val="20"/>
-          <w:szCs w:val="20"/>
-          <w:lang w:val="en-US"/>
-        </w:rPr>
-        <w:t>Client Representative:</w:t>
-      </w:r>
-      <w:r>
-        <w:rPr>
-          <w:sz w:val="20"/>
-          <w:szCs w:val="20"/>
-          <w:lang w:val="en-US"/>
-        </w:rPr>
-        <w:t xml:space="preserve"> </w:t>
-      </w:r>
-      <w:r>
-        <w:rPr>
-          <w:sz w:val="20"/>
-          <w:lang w:val="en-US"/>
-        </w:rPr>
-        <w:t>{{REPRESENTATIVE_NAME}}</w:t>
-      </w:r>
-    </w:p>
-    <w:p>
-      <w:pPr>
-        <w:spacing w:after="40"/>
-        <w:rPr>
-          <w:lang w:val="en-US"/>
-        </w:rPr>
-      </w:pPr>
-      <w:r>
-        <w:rPr>
-          <w:sz w:val="20"/>
-          <w:lang w:val="en-US"/>
-        </w:rPr>
-        <w:t>{{REPRESENTATIVE_EMAIL}}</w:t>
-      </w:r>
-      <w:r>
-        <w:rPr>
-          <w:sz w:val="20"/>
-          <w:szCs w:val="20"/>
-          <w:lang w:val="en-US"/>
-        </w:rPr>
-        <w:t xml:space="preserve"> </w:t>
-      </w:r>
-    </w:p>
-    <w:p>
-      <w:pPr>
-        <w:spacing w:after="0"/>
-        <w:rPr>
-          <w:sz w:val="20"/>
-          <w:szCs w:val="20"/>
-          <w:lang w:val="en-US"/>
-        </w:rPr>
-      </w:pPr>
-      <w:r>
-        <w:rPr>
-          <w:sz w:val="20"/>
-          <w:szCs w:val="20"/>
-          <w:lang w:val="en-US"/>
-        </w:rPr>
-        <w:t xml:space="preserve">Ph: </w:t>
-      </w:r>
-      <w:r>
-        <w:rPr>
-          <w:sz w:val="20"/>
-          <w:lang w:val="en-US"/>
-        </w:rPr>
-        <w:t>{{REPRESENTATIVE_PHONE}}</w:t>
-      </w:r>
-    </w:p>
-    <w:p>
-      <w:pPr>
-        <w:spacing w:after="0"/>
-        <w:rPr>
-          <w:sz w:val="20"/>
-          <w:szCs w:val="20"/>
-          <w:lang w:val="en-US"/>
-        </w:rPr>
-      </w:pPr>
-      <w:r>
-        <w:rPr>
-          <w:b/>
-          <w:bCs/>
-          <w:sz w:val="20"/>
-          <w:szCs w:val="20"/>
-          <w:lang w:val="en-US"/>
-        </w:rPr>
-        <w:t>Start:</w:t>
-      </w:r>
-      <w:r>
-        <w:rPr>
-          <w:sz w:val="20"/>
-          <w:szCs w:val="20"/>
-          <w:lang w:val="en-US"/>
-        </w:rPr>
-        <w:t xml:space="preserve"> </w:t>
-      </w:r>
-      <w:r>
-        <w:rPr>
-          <w:sz w:val="20"/>
-          <w:lang w:val="en-US"/>
-        </w:rPr>
-        <w:t>{{EVENT_START}}</w:t>
-      </w:r>
-    </w:p>
-    <w:p>
-      <w:pPr>
-        <w:spacing w:after="0"/>
-        <w:rPr>
-          <w:sz w:val="20"/>
-          <w:szCs w:val="20"/>
-          <w:lang w:val="en-US"/>
-        </w:rPr>
-      </w:pPr>
-      <w:r>
-        <w:rPr>
-          <w:b/>
-          <w:bCs/>
-          <w:sz w:val="20"/>
-          <w:szCs w:val="20"/>
-          <w:lang w:val="en-US"/>
-        </w:rPr>
-        <w:t>End:</w:t>
-      </w:r>
-      <w:r>
-        <w:rPr>
-          <w:sz w:val="20"/>
-          <w:szCs w:val="20"/>
-          <w:lang w:val="en-US"/>
-        </w:rPr>
-        <w:t xml:space="preserve"> </w:t>
-      </w:r>
-      <w:r>
-        <w:rPr>
-          <w:sz w:val="20"/>
-          <w:lang w:val="en-US"/>
-        </w:rPr>
-        <w:t>{{EVENT_END}}</w:t>
-      </w:r>
-    </w:p>
-    <w:p>
-      <w:pPr>
-        <w:spacing w:after="0"/>
-        <w:rPr>
-          <w:sz w:val="20"/>
-          <w:szCs w:val="20"/>
-          <w:lang w:val="en-US"/>
-        </w:rPr>
-      </w:pPr>
-      <w:r>
-        <w:rPr>
-          <w:b/>
-          <w:bCs/>
-          <w:sz w:val="20"/>
-          <w:szCs w:val="20"/>
-          <w:lang w:val="en-US"/>
-        </w:rPr>
-        <w:t>Guests</w:t>
-      </w:r>
-      <w:r>
-        <w:rPr>
-          <w:sz w:val="20"/>
-          <w:szCs w:val="20"/>
-          <w:lang w:val="en-US"/>
-        </w:rPr>
-        <w:t xml:space="preserve">: </w:t>
-      </w:r>
-      <w:r>
-        <w:rPr>
-          <w:sz w:val="20"/>
-          <w:lang w:val="en-US"/>
-        </w:rPr>
-        <w:t>{{EVENT_GUESTS}}</w:t>
-      </w:r>
-    </w:p>
-    <w:p>
-      <w:pPr>
         <w:spacing w:after="0"/>
         <w:rPr>
           <w:sz w:val="22"/>
@@ -1422,6 +1193,50 @@
       <w:pPr>
         <w:spacing w:after="0"/>
         <w:jc w:val="center"/>
+        <w:rPr>
+          <w:sz w:val="22"/>
+          <w:szCs w:val="22"/>
+          <w:lang w:val="en-US"/>
+        </w:rPr>
+      </w:pPr>
+    </w:p>
+    <w:p>
+      <w:pPr>
+        <w:spacing w:after="0"/>
+        <w:jc w:val="both"/>
+        <w:rPr>
+          <w:sz w:val="22"/>
+          <w:szCs w:val="22"/>
+          <w:lang w:val="en-US"/>
+        </w:rPr>
+      </w:pPr>
+    </w:p>
+    <w:p>
+      <w:pPr>
+        <w:spacing w:after="0"/>
+        <w:jc w:val="both"/>
+        <w:rPr>
+          <w:sz w:val="22"/>
+          <w:szCs w:val="22"/>
+          <w:lang w:val="en-US"/>
+        </w:rPr>
+      </w:pPr>
+    </w:p>
+    <w:p>
+      <w:pPr>
+        <w:spacing w:after="0"/>
+        <w:jc w:val="both"/>
+        <w:rPr>
+          <w:sz w:val="22"/>
+          <w:szCs w:val="22"/>
+          <w:lang w:val="en-US"/>
+        </w:rPr>
+      </w:pPr>
+    </w:p>
+    <w:p>
+      <w:pPr>
+        <w:spacing w:after="0"/>
+        <w:jc w:val="both"/>
         <w:rPr>
           <w:sz w:val="22"/>
           <w:szCs w:val="22"/>
@@ -2395,6 +2210,7 @@
           <w:szCs w:val="22"/>
           <w:lang w:val="en-US"/>
         </w:rPr>
+        <w:lastRenderedPageBreak/>
         <mc:AlternateContent>
           <mc:Choice Requires="wps">
             <w:drawing>
@@ -2864,6 +2680,577 @@
 
 <file path=word/header1.xml><?xml version="1.0" encoding="utf-8"?>
 <w:hdr xmlns:wpc="http://schemas.microsoft.com/office/word/2010/wordprocessingCanvas" xmlns:cx="http://schemas.microsoft.com/office/drawing/2014/chartex" xmlns:cx1="http://schemas.microsoft.com/office/drawing/2015/9/8/chartex" xmlns:cx2="http://schemas.microsoft.com/office/drawing/2015/10/21/chartex" xmlns:cx3="http://schemas.microsoft.com/office/drawing/2016/5/9/chartex" xmlns:cx4="http://schemas.microsoft.com/office/drawing/2016/5/10/chartex" xmlns:cx5="http://schemas.microsoft.com/office/drawing/2016/5/11/chartex" xmlns:cx6="http://schemas.microsoft.com/office/drawing/2016/5/12/chartex" xmlns:cx7="http://schemas.microsoft.com/office/drawing/2016/5/13/chartex" xmlns:cx8="http://schemas.microsoft.com/office/drawing/2016/5/14/chartex" xmlns:mc="http://schemas.openxmlformats.org/markup-compatibility/2006" xmlns:aink="http://schemas.microsoft.com/office/drawing/2016/ink" xmlns:am3d="http://schemas.microsoft.com/office/drawing/2017/model3d" xmlns:o="urn:schemas-microsoft-com:office:office" xmlns:oel="http://schemas.microsoft.com/office/2019/extlst" xmlns:r="http://schemas.openxmlformats.org/officeDocument/2006/relationships" xmlns:m="http://schemas.openxmlformats.org/officeDocument/2006/math" xmlns:v="urn:schemas-microsoft-com:vml" xmlns:wp14="http://schemas.microsoft.com/office/word/2010/wordprocessingDrawing" xmlns:wp="http://schemas.openxmlformats.org/drawingml/2006/wordprocessingDrawing" xmlns:w10="urn:schemas-microsoft-com:office:word" xmlns:w="http://schemas.openxmlformats.org/wordprocessingml/2006/main" xmlns:w14="http://schemas.microsoft.com/office/word/2010/wordml" xmlns:w15="http://schemas.microsoft.com/office/word/2012/wordml" xmlns:w16cex="http://schemas.microsoft.com/office/word/2018/wordml/cex" xmlns:w16cid="http://schemas.microsoft.com/office/word/2016/wordml/cid" xmlns:w16="http://schemas.microsoft.com/office/word/2018/wordml" xmlns:w16du="http://schemas.microsoft.com/office/word/2023/wordml/word16du" xmlns:w16sdtdh="http://schemas.microsoft.com/office/word/2020/wordml/sdtdatahash" xmlns:w16sdtfl="http://schemas.microsoft.com/office/word/2024/wordml/sdtformatlock" xmlns:w16se="http://schemas.microsoft.com/office/word/2015/wordml/symex" xmlns:wpg="http://schemas.microsoft.com/office/word/2010/wordprocessingGroup" xmlns:wpi="http://schemas.microsoft.com/office/word/2010/wordprocessingInk" xmlns:wne="http://schemas.microsoft.com/office/word/2006/wordml" xmlns:wps="http://schemas.microsoft.com/office/word/2010/wordprocessingShape" mc:Ignorable="w14 w15 w16se w16cid w16 w16cex w16sdtdh w16sdtfl w16du wp14">
+  <w:p>
+    <w:pPr>
+      <w:jc w:val="right"/>
+      <w:rPr>
+        <w:sz w:val="18"/>
+        <w:szCs w:val="18"/>
+      </w:rPr>
+    </w:pPr>
+    <w:r>
+      <w:rPr>
+        <w:noProof/>
+        <w:sz w:val="18"/>
+        <w:szCs w:val="18"/>
+      </w:rPr>
+      <mc:AlternateContent>
+        <mc:Choice Requires="wps">
+          <w:drawing>
+            <wp:anchor distT="45720" distB="45720" distL="114300" distR="114300" simplePos="0" relativeHeight="251661312" behindDoc="0" locked="0" layoutInCell="1" allowOverlap="1" wp14:anchorId="517C2E98" wp14:editId="132ED2F9">
+              <wp:simplePos x="0" y="0"/>
+              <wp:positionH relativeFrom="column">
+                <wp:posOffset>-870585</wp:posOffset>
+              </wp:positionH>
+              <wp:positionV relativeFrom="paragraph">
+                <wp:posOffset>409575</wp:posOffset>
+              </wp:positionV>
+              <wp:extent cx="2360930" cy="1285875"/>
+              <wp:effectExtent l="0" t="0" r="3175" b="9525"/>
+              <wp:wrapSquare wrapText="bothSides"/>
+              <wp:docPr id="217" name="Cuadro de texto 2"/>
+              <wp:cNvGraphicFramePr>
+                <a:graphicFrameLocks xmlns:a="http://schemas.openxmlformats.org/drawingml/2006/main"/>
+              </wp:cNvGraphicFramePr>
+              <a:graphic xmlns:a="http://schemas.openxmlformats.org/drawingml/2006/main">
+                <a:graphicData uri="http://schemas.microsoft.com/office/word/2010/wordprocessingShape">
+                  <wps:wsp>
+                    <wps:cNvSpPr txBox="1">
+                      <a:spLocks noChangeArrowheads="1"/>
+                    </wps:cNvSpPr>
+                    <wps:spPr bwMode="auto">
+                      <a:xfrm>
+                        <a:off x="0" y="0"/>
+                        <a:ext cx="2360930" cy="1285875"/>
+                      </a:xfrm>
+                      <a:prstGeom prst="rect">
+                        <a:avLst/>
+                      </a:prstGeom>
+                      <a:solidFill>
+                        <a:srgbClr val="FFFFFF"/>
+                      </a:solidFill>
+                      <a:ln w="9525">
+                        <a:noFill/>
+                        <a:miter lim="800000"/>
+                        <a:headEnd/>
+                        <a:tailEnd/>
+                      </a:ln>
+                    </wps:spPr>
+                    <wps:txbx>
+                      <w:txbxContent>
+                        <w:p>
+                          <w:pPr>
+                            <w:pStyle w:val="Ttulo1"/>
+                            <w:spacing w:before="0" w:after="0"/>
+                            <w:jc w:val="both"/>
+                            <w:rPr>
+                              <w:rFonts w:asciiTheme="minorHAnsi" w:hAnsiTheme="minorHAnsi"/>
+                              <w:color w:val="501549" w:themeColor="accent5" w:themeShade="80"/>
+                              <w:sz w:val="16"/>
+                              <w:szCs w:val="16"/>
+                              <w:lang w:val="en-US"/>
+                            </w:rPr>
+                          </w:pPr>
+                          <w:r>
+                            <w:rPr>
+                              <w:rFonts w:asciiTheme="minorHAnsi" w:hAnsiTheme="minorHAnsi"/>
+                              <w:color w:val="501549" w:themeColor="accent5" w:themeShade="80"/>
+                              <w:sz w:val="16"/>
+                              <w:szCs w:val="16"/>
+                              <w:lang w:val="en-US"/>
+                            </w:rPr>
+                            <w:t>{{CLIENT_NAME}}</w:t>
+                          </w:r>
+                        </w:p>
+                        <w:p>
+                          <w:pPr>
+                            <w:spacing w:after="0"/>
+                            <w:rPr>
+                              <w:sz w:val="14"/>
+                              <w:szCs w:val="14"/>
+                              <w:lang w:val="en-US"/>
+                            </w:rPr>
+                          </w:pPr>
+                          <w:r>
+                            <w:rPr>
+                              <w:sz w:val="14"/>
+                              <w:szCs w:val="14"/>
+                              <w:lang w:val="en-US"/>
+                            </w:rPr>
+                            <w:t>{{CLIENT_ADDRESS}}</w:t>
+                          </w:r>
+                        </w:p>
+                        <w:p>
+                          <w:pPr>
+                            <w:spacing w:after="40"/>
+                            <w:rPr>
+                              <w:sz w:val="18"/>
+                              <w:szCs w:val="18"/>
+                              <w:lang w:val="en-US"/>
+                            </w:rPr>
+                          </w:pPr>
+                          <w:r>
+                            <w:rPr>
+                              <w:b/>
+                              <w:bCs/>
+                              <w:sz w:val="14"/>
+                              <w:szCs w:val="14"/>
+                              <w:lang w:val="en-US"/>
+                            </w:rPr>
+                            <w:t>Client Representative:</w:t>
+                          </w:r>
+                          <w:r>
+                            <w:rPr>
+                              <w:sz w:val="14"/>
+                              <w:szCs w:val="14"/>
+                              <w:lang w:val="en-US"/>
+                            </w:rPr>
+                            <w:t xml:space="preserve"> </w:t>
+                          </w:r>
+                          <w:r>
+                            <w:rPr>
+                              <w:sz w:val="14"/>
+                              <w:szCs w:val="18"/>
+                              <w:lang w:val="en-US"/>
+                            </w:rPr>
+                            <w:t>{{REPRESENTATIVE_NAME}}</w:t>
+                          </w:r>
+                        </w:p>
+                        <w:p>
+                          <w:pPr>
+                            <w:spacing w:after="40"/>
+                            <w:rPr>
+                              <w:sz w:val="18"/>
+                              <w:szCs w:val="18"/>
+                              <w:lang w:val="en-US"/>
+                            </w:rPr>
+                          </w:pPr>
+                          <w:r>
+                            <w:rPr>
+                              <w:sz w:val="14"/>
+                              <w:szCs w:val="18"/>
+                              <w:lang w:val="en-US"/>
+                            </w:rPr>
+                            <w:t>{{REPRESENTATIVE_EMAIL}}</w:t>
+                          </w:r>
+                          <w:r>
+                            <w:rPr>
+                              <w:sz w:val="14"/>
+                              <w:szCs w:val="14"/>
+                              <w:lang w:val="en-US"/>
+                            </w:rPr>
+                            <w:t xml:space="preserve"> </w:t>
+                          </w:r>
+                        </w:p>
+                        <w:p>
+                          <w:pPr>
+                            <w:spacing w:after="0"/>
+                            <w:rPr>
+                              <w:sz w:val="14"/>
+                              <w:szCs w:val="14"/>
+                              <w:lang w:val="en-US"/>
+                            </w:rPr>
+                          </w:pPr>
+                          <w:r>
+                            <w:rPr>
+                              <w:sz w:val="14"/>
+                              <w:szCs w:val="14"/>
+                              <w:lang w:val="en-US"/>
+                            </w:rPr>
+                            <w:t xml:space="preserve">Ph: </w:t>
+                          </w:r>
+                          <w:r>
+                            <w:rPr>
+                              <w:sz w:val="14"/>
+                              <w:szCs w:val="18"/>
+                              <w:lang w:val="en-US"/>
+                            </w:rPr>
+                            <w:t>{{REPRESENTATIVE_PHONE}}</w:t>
+                          </w:r>
+                        </w:p>
+                        <w:p>
+                          <w:pPr>
+                            <w:spacing w:after="0"/>
+                            <w:rPr>
+                              <w:sz w:val="14"/>
+                              <w:szCs w:val="14"/>
+                              <w:lang w:val="en-US"/>
+                            </w:rPr>
+                          </w:pPr>
+                          <w:r>
+                            <w:rPr>
+                              <w:b/>
+                              <w:bCs/>
+                              <w:sz w:val="14"/>
+                              <w:szCs w:val="14"/>
+                              <w:lang w:val="en-US"/>
+                            </w:rPr>
+                            <w:t>Start:</w:t>
+                          </w:r>
+                          <w:r>
+                            <w:rPr>
+                              <w:sz w:val="14"/>
+                              <w:szCs w:val="14"/>
+                              <w:lang w:val="en-US"/>
+                            </w:rPr>
+                            <w:t xml:space="preserve"> </w:t>
+                          </w:r>
+                          <w:r>
+                            <w:rPr>
+                              <w:sz w:val="14"/>
+                              <w:szCs w:val="18"/>
+                              <w:lang w:val="en-US"/>
+                            </w:rPr>
+                            <w:t>{{EVENT_START}}</w:t>
+                          </w:r>
+                        </w:p>
+                        <w:p>
+                          <w:pPr>
+                            <w:spacing w:after="0"/>
+                            <w:rPr>
+                              <w:sz w:val="14"/>
+                              <w:szCs w:val="14"/>
+                              <w:lang w:val="en-US"/>
+                            </w:rPr>
+                          </w:pPr>
+                          <w:r>
+                            <w:rPr>
+                              <w:b/>
+                              <w:bCs/>
+                              <w:sz w:val="14"/>
+                              <w:szCs w:val="14"/>
+                              <w:lang w:val="en-US"/>
+                            </w:rPr>
+                            <w:t>End:</w:t>
+                          </w:r>
+                          <w:r>
+                            <w:rPr>
+                              <w:sz w:val="14"/>
+                              <w:szCs w:val="14"/>
+                              <w:lang w:val="en-US"/>
+                            </w:rPr>
+                            <w:t xml:space="preserve"> </w:t>
+                          </w:r>
+                          <w:r>
+                            <w:rPr>
+                              <w:sz w:val="14"/>
+                              <w:szCs w:val="18"/>
+                              <w:lang w:val="en-US"/>
+                            </w:rPr>
+                            <w:t>{{EVENT_END}}</w:t>
+                          </w:r>
+                        </w:p>
+                        <w:p>
+                          <w:pPr>
+                            <w:spacing w:after="0"/>
+                            <w:rPr>
+                              <w:sz w:val="14"/>
+                              <w:szCs w:val="14"/>
+                              <w:lang w:val="en-US"/>
+                            </w:rPr>
+                          </w:pPr>
+                          <w:r>
+                            <w:rPr>
+                              <w:b/>
+                              <w:bCs/>
+                              <w:sz w:val="14"/>
+                              <w:szCs w:val="14"/>
+                              <w:lang w:val="en-US"/>
+                            </w:rPr>
+                            <w:t>Guests</w:t>
+                          </w:r>
+                          <w:r>
+                            <w:rPr>
+                              <w:sz w:val="14"/>
+                              <w:szCs w:val="14"/>
+                              <w:lang w:val="en-US"/>
+                            </w:rPr>
+                            <w:t xml:space="preserve">: </w:t>
+                          </w:r>
+                          <w:r>
+                            <w:rPr>
+                              <w:sz w:val="14"/>
+                              <w:szCs w:val="18"/>
+                              <w:lang w:val="en-US"/>
+                            </w:rPr>
+                            <w:t>{{EVENT_GUESTS}}</w:t>
+                          </w:r>
+                        </w:p>
+                        <w:p/>
+                      </w:txbxContent>
+                    </wps:txbx>
+                    <wps:bodyPr rot="0" vert="horz" wrap="square" lIns="91440" tIns="45720" rIns="91440" bIns="45720" anchor="t" anchorCtr="0">
+                      <a:noAutofit/>
+                    </wps:bodyPr>
+                  </wps:wsp>
+                </a:graphicData>
+              </a:graphic>
+              <wp14:sizeRelH relativeFrom="margin">
+                <wp14:pctWidth>40000</wp14:pctWidth>
+              </wp14:sizeRelH>
+              <wp14:sizeRelV relativeFrom="margin">
+                <wp14:pctHeight>0</wp14:pctHeight>
+              </wp14:sizeRelV>
+            </wp:anchor>
+          </w:drawing>
+        </mc:Choice>
+        <mc:Fallback>
+          <w:pict>
+            <v:shapetype w14:anchorId="517C2E98" id="_x0000_t202" coordsize="21600,21600" o:spt="202" path="m,l,21600r21600,l21600,xe">
+              <v:stroke joinstyle="miter"/>
+              <v:path gradientshapeok="t" o:connecttype="rect"/>
+            </v:shapetype>
+            <v:shape id="Cuadro de texto 2" o:spid="_x0000_s1026" type="#_x0000_t202" style="position:absolute;left:0;text-align:left;margin-left:-68.55pt;margin-top:32.25pt;width:185.9pt;height:101.25pt;z-index:251661312;visibility:visible;mso-wrap-style:square;mso-width-percent:400;mso-height-percent:0;mso-wrap-distance-left:9pt;mso-wrap-distance-top:3.6pt;mso-wrap-distance-right:9pt;mso-wrap-distance-bottom:3.6pt;mso-position-horizontal:absolute;mso-position-horizontal-relative:text;mso-position-vertical:absolute;mso-position-vertical-relative:text;mso-width-percent:400;mso-height-percent:0;mso-width-relative:margin;mso-height-relative:margin;v-text-anchor:top" o:gfxdata="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" stroked="f">
+              <v:textbox>
+                <w:txbxContent>
+                  <w:p>
+                    <w:pPr>
+                      <w:pStyle w:val="Ttulo1"/>
+                      <w:spacing w:before="0" w:after="0"/>
+                      <w:jc w:val="both"/>
+                      <w:rPr>
+                        <w:rFonts w:asciiTheme="minorHAnsi" w:hAnsiTheme="minorHAnsi"/>
+                        <w:color w:val="501549" w:themeColor="accent5" w:themeShade="80"/>
+                        <w:sz w:val="16"/>
+                        <w:szCs w:val="16"/>
+                        <w:lang w:val="en-US"/>
+                      </w:rPr>
+                    </w:pPr>
+                    <w:r>
+                      <w:rPr>
+                        <w:rFonts w:asciiTheme="minorHAnsi" w:hAnsiTheme="minorHAnsi"/>
+                        <w:color w:val="501549" w:themeColor="accent5" w:themeShade="80"/>
+                        <w:sz w:val="16"/>
+                        <w:szCs w:val="16"/>
+                        <w:lang w:val="en-US"/>
+                      </w:rPr>
+                      <w:t>{{CLIENT_NAME}}</w:t>
+                    </w:r>
+                  </w:p>
+                  <w:p>
+                    <w:pPr>
+                      <w:spacing w:after="0"/>
+                      <w:rPr>
+                        <w:sz w:val="14"/>
+                        <w:szCs w:val="14"/>
+                        <w:lang w:val="en-US"/>
+                      </w:rPr>
+                    </w:pPr>
+                    <w:r>
+                      <w:rPr>
+                        <w:sz w:val="14"/>
+                        <w:szCs w:val="14"/>
+                        <w:lang w:val="en-US"/>
+                      </w:rPr>
+                      <w:t>{{CLIENT_ADDRESS}}</w:t>
+                    </w:r>
+                  </w:p>
+                  <w:p>
+                    <w:pPr>
+                      <w:spacing w:after="40"/>
+                      <w:rPr>
+                        <w:sz w:val="18"/>
+                        <w:szCs w:val="18"/>
+                        <w:lang w:val="en-US"/>
+                      </w:rPr>
+                    </w:pPr>
+                    <w:r>
+                      <w:rPr>
+                        <w:b/>
+                        <w:bCs/>
+                        <w:sz w:val="14"/>
+                        <w:szCs w:val="14"/>
+                        <w:lang w:val="en-US"/>
+                      </w:rPr>
+                      <w:t>Client Representative:</w:t>
+                    </w:r>
+                    <w:r>
+                      <w:rPr>
+                        <w:sz w:val="14"/>
+                        <w:szCs w:val="14"/>
+                        <w:lang w:val="en-US"/>
+                      </w:rPr>
+                      <w:t xml:space="preserve"> </w:t>
+                    </w:r>
+                    <w:r>
+                      <w:rPr>
+                        <w:sz w:val="14"/>
+                        <w:szCs w:val="18"/>
+                        <w:lang w:val="en-US"/>
+                      </w:rPr>
+                      <w:t>{{REPRESENTATIVE_NAME}}</w:t>
+                    </w:r>
+                  </w:p>
+                  <w:p>
+                    <w:pPr>
+                      <w:spacing w:after="40"/>
+                      <w:rPr>
+                        <w:sz w:val="18"/>
+                        <w:szCs w:val="18"/>
+                        <w:lang w:val="en-US"/>
+                      </w:rPr>
+                    </w:pPr>
+                    <w:r>
+                      <w:rPr>
+                        <w:sz w:val="14"/>
+                        <w:szCs w:val="18"/>
+                        <w:lang w:val="en-US"/>
+                      </w:rPr>
+                      <w:t>{{REPRESENTATIVE_EMAIL}}</w:t>
+                    </w:r>
+                    <w:r>
+                      <w:rPr>
+                        <w:sz w:val="14"/>
+                        <w:szCs w:val="14"/>
+                        <w:lang w:val="en-US"/>
+                      </w:rPr>
+                      <w:t xml:space="preserve"> </w:t>
+                    </w:r>
+                  </w:p>
+                  <w:p>
+                    <w:pPr>
+                      <w:spacing w:after="0"/>
+                      <w:rPr>
+                        <w:sz w:val="14"/>
+                        <w:szCs w:val="14"/>
+                        <w:lang w:val="en-US"/>
+                      </w:rPr>
+                    </w:pPr>
+                    <w:r>
+                      <w:rPr>
+                        <w:sz w:val="14"/>
+                        <w:szCs w:val="14"/>
+                        <w:lang w:val="en-US"/>
+                      </w:rPr>
+                      <w:t xml:space="preserve">Ph: </w:t>
+                    </w:r>
+                    <w:r>
+                      <w:rPr>
+                        <w:sz w:val="14"/>
+                        <w:szCs w:val="18"/>
+                        <w:lang w:val="en-US"/>
+                      </w:rPr>
+                      <w:t>{{REPRESENTATIVE_PHONE}}</w:t>
+                    </w:r>
+                  </w:p>
+                  <w:p>
+                    <w:pPr>
+                      <w:spacing w:after="0"/>
+                      <w:rPr>
+                        <w:sz w:val="14"/>
+                        <w:szCs w:val="14"/>
+                        <w:lang w:val="en-US"/>
+                      </w:rPr>
+                    </w:pPr>
+                    <w:r>
+                      <w:rPr>
+                        <w:b/>
+                        <w:bCs/>
+                        <w:sz w:val="14"/>
+                        <w:szCs w:val="14"/>
+                        <w:lang w:val="en-US"/>
+                      </w:rPr>
+                      <w:t>Start:</w:t>
+                    </w:r>
+                    <w:r>
+                      <w:rPr>
+                        <w:sz w:val="14"/>
+                        <w:szCs w:val="14"/>
+                        <w:lang w:val="en-US"/>
+                      </w:rPr>
+                      <w:t xml:space="preserve"> </w:t>
+                    </w:r>
+                    <w:r>
+                      <w:rPr>
+                        <w:sz w:val="14"/>
+                        <w:szCs w:val="18"/>
+                        <w:lang w:val="en-US"/>
+                      </w:rPr>
+                      <w:t>{{EVENT_START}}</w:t>
+                    </w:r>
+                  </w:p>
+                  <w:p>
+                    <w:pPr>
+                      <w:spacing w:after="0"/>
+                      <w:rPr>
+                        <w:sz w:val="14"/>
+                        <w:szCs w:val="14"/>
+                        <w:lang w:val="en-US"/>
+                      </w:rPr>
+                    </w:pPr>
+                    <w:r>
+                      <w:rPr>
+                        <w:b/>
+                        <w:bCs/>
+                        <w:sz w:val="14"/>
+                        <w:szCs w:val="14"/>
+                        <w:lang w:val="en-US"/>
+                      </w:rPr>
+                      <w:t>End:</w:t>
+                    </w:r>
+                    <w:r>
+                      <w:rPr>
+                        <w:sz w:val="14"/>
+                        <w:szCs w:val="14"/>
+                        <w:lang w:val="en-US"/>
+                      </w:rPr>
+                      <w:t xml:space="preserve"> </w:t>
+                    </w:r>
+                    <w:r>
+                      <w:rPr>
+                        <w:sz w:val="14"/>
+                        <w:szCs w:val="18"/>
+                        <w:lang w:val="en-US"/>
+                      </w:rPr>
+                      <w:t>{{EVENT_END}}</w:t>
+                    </w:r>
+                  </w:p>
+                  <w:p>
+                    <w:pPr>
+                      <w:spacing w:after="0"/>
+                      <w:rPr>
+                        <w:sz w:val="14"/>
+                        <w:szCs w:val="14"/>
+                        <w:lang w:val="en-US"/>
+                      </w:rPr>
+                    </w:pPr>
+                    <w:r>
+                      <w:rPr>
+                        <w:b/>
+                        <w:bCs/>
+                        <w:sz w:val="14"/>
+                        <w:szCs w:val="14"/>
+                        <w:lang w:val="en-US"/>
+                      </w:rPr>
+                      <w:t>Guests</w:t>
+                    </w:r>
+                    <w:r>
+                      <w:rPr>
+                        <w:sz w:val="14"/>
+                        <w:szCs w:val="14"/>
+                        <w:lang w:val="en-US"/>
+                      </w:rPr>
+                      <w:t xml:space="preserve">: </w:t>
+                    </w:r>
+                    <w:r>
+                      <w:rPr>
+                        <w:sz w:val="14"/>
+                        <w:szCs w:val="18"/>
+                        <w:lang w:val="en-US"/>
+                      </w:rPr>
+                      <w:t>{{EVENT_GUESTS}}</w:t>
+                    </w:r>
+                  </w:p>
+                  <w:p/>
+                </w:txbxContent>
+              </v:textbox>
+              <w10:wrap type="square"/>
+            </v:shape>
+          </w:pict>
+        </mc:Fallback>
+      </mc:AlternateContent>
+    </w:r>
+  </w:p>
   <w:sdt>
     <w:sdtPr>
       <w:rPr>

</xml_diff>